<commit_message>
Entrega Ajustes Validación Laura G
</commit_message>
<xml_diff>
--- a/fuentes/CF1_63310033_DI.docx
+++ b/fuentes/CF1_63310033_DI.docx
@@ -1000,7 +1000,31 @@
           <w:sz w:val="20"/>
           <w:szCs w:val="20"/>
         </w:rPr>
-        <w:t>, los destinos que preservan y promueven su patrimonio natural no solo fomentan el turismo sostenible, sino que también generan oportunidades de desarrollo local, conservación ambiental y fortalecimiento de la identidad cultural.</w:t>
+        <w:t xml:space="preserve">, los destinos que preservan y promueven su patrimonio natural no solo fomentan el turismo sostenible, sino que también generan oportunidades de desarrollo local, conservación ambiental y fortalecimiento de la identidad </w:t>
+      </w:r>
+      <w:commentRangeStart w:id="0"/>
+      <w:r>
+        <w:rPr>
+          <w:bCs/>
+          <w:sz w:val="20"/>
+          <w:szCs w:val="20"/>
+        </w:rPr>
+        <w:t>cultural</w:t>
+      </w:r>
+      <w:commentRangeEnd w:id="0"/>
+      <w:r>
+        <w:rPr>
+          <w:rStyle w:val="Refdecomentario"/>
+        </w:rPr>
+        <w:commentReference w:id="0"/>
+      </w:r>
+      <w:r>
+        <w:rPr>
+          <w:bCs/>
+          <w:sz w:val="20"/>
+          <w:szCs w:val="20"/>
+        </w:rPr>
+        <w:t>.</w:t>
       </w:r>
     </w:p>
     <w:p>
@@ -1086,7 +1110,7 @@
         <w:lastRenderedPageBreak/>
         <w:t xml:space="preserve">¿Qué es la </w:t>
       </w:r>
-      <w:commentRangeStart w:id="0"/>
+      <w:commentRangeStart w:id="1"/>
       <w:r>
         <w:rPr>
           <w:b/>
@@ -1096,14 +1120,14 @@
         </w:rPr>
         <w:t>biodiversidad</w:t>
       </w:r>
-      <w:commentRangeEnd w:id="0"/>
+      <w:commentRangeEnd w:id="1"/>
       <w:r>
         <w:rPr>
           <w:rStyle w:val="Refdecomentario"/>
           <w:sz w:val="20"/>
           <w:szCs w:val="20"/>
         </w:rPr>
-        <w:commentReference w:id="0"/>
+        <w:commentReference w:id="1"/>
       </w:r>
       <w:r>
         <w:rPr>
@@ -1558,16 +1582,6 @@
     </w:p>
     <w:p>
       <w:pPr>
-        <w:pStyle w:val="Prrafodelista"/>
-        <w:spacing w:line="360" w:lineRule="auto"/>
-        <w:rPr>
-          <w:sz w:val="20"/>
-          <w:szCs w:val="20"/>
-        </w:rPr>
-      </w:pPr>
-    </w:p>
-    <w:p>
-      <w:pPr>
         <w:spacing w:line="360" w:lineRule="auto"/>
         <w:rPr>
           <w:sz w:val="20"/>
@@ -1629,7 +1643,7 @@
           <w:szCs w:val="20"/>
         </w:rPr>
       </w:pPr>
-      <w:commentRangeStart w:id="1"/>
+      <w:commentRangeStart w:id="2"/>
       <w:r>
         <w:rPr>
           <w:noProof/>
@@ -1700,14 +1714,14 @@
           </wp:anchor>
         </w:drawing>
       </w:r>
-      <w:commentRangeEnd w:id="1"/>
+      <w:commentRangeEnd w:id="2"/>
       <w:r>
         <w:rPr>
           <w:rStyle w:val="Refdecomentario"/>
           <w:sz w:val="20"/>
           <w:szCs w:val="20"/>
         </w:rPr>
-        <w:commentReference w:id="1"/>
+        <w:commentReference w:id="2"/>
       </w:r>
     </w:p>
     <w:p>
@@ -1726,7 +1740,7 @@
         </w:rPr>
         <w:t>“</w:t>
       </w:r>
-      <w:commentRangeStart w:id="2"/>
+      <w:commentRangeStart w:id="3"/>
       <w:r>
         <w:rPr>
           <w:sz w:val="20"/>
@@ -1734,14 +1748,14 @@
         </w:rPr>
         <w:t>Un complejo dinámico de comunidades vegetales, animales y de microorganismos, y su medio no viviente, que interactúan como una unidad funcional”.</w:t>
       </w:r>
-      <w:commentRangeEnd w:id="2"/>
+      <w:commentRangeEnd w:id="3"/>
       <w:r>
         <w:rPr>
           <w:rStyle w:val="Refdecomentario"/>
           <w:sz w:val="20"/>
           <w:szCs w:val="20"/>
         </w:rPr>
-        <w:commentReference w:id="2"/>
+        <w:commentReference w:id="3"/>
       </w:r>
     </w:p>
     <w:p>
@@ -1770,7 +1784,7 @@
         </w:rPr>
         <w:t xml:space="preserve">Otra definición señala que un ecosistema es un conjunto natural relativamente estable, en el cual las relaciones entre los seres vivos y las condiciones ambientales permiten su mantenimiento en el tiempo (Ministerio de Ambiente y Desarrollo Sostenible, </w:t>
       </w:r>
-      <w:commentRangeStart w:id="3"/>
+      <w:commentRangeStart w:id="4"/>
       <w:r>
         <w:rPr>
           <w:sz w:val="20"/>
@@ -1778,14 +1792,14 @@
         </w:rPr>
         <w:t>2017</w:t>
       </w:r>
-      <w:commentRangeEnd w:id="3"/>
+      <w:commentRangeEnd w:id="4"/>
       <w:r>
         <w:rPr>
           <w:rStyle w:val="Refdecomentario"/>
           <w:sz w:val="20"/>
           <w:szCs w:val="20"/>
         </w:rPr>
-        <w:commentReference w:id="3"/>
+        <w:commentReference w:id="4"/>
       </w:r>
       <w:r>
         <w:rPr>
@@ -2005,7 +2019,6 @@
           <w:sz w:val="20"/>
           <w:szCs w:val="20"/>
         </w:rPr>
-        <w:lastRenderedPageBreak/>
         <w:t xml:space="preserve">Según el </w:t>
       </w:r>
       <w:r>
@@ -2101,7 +2114,7 @@
         </w:rPr>
         <w:t xml:space="preserve">“El lugar o tipo de ambiente en el que existen naturalmente </w:t>
       </w:r>
-      <w:commentRangeStart w:id="4"/>
+      <w:commentRangeStart w:id="5"/>
       <w:r>
         <w:rPr>
           <w:b/>
@@ -2111,14 +2124,14 @@
         </w:rPr>
         <w:t>un</w:t>
       </w:r>
-      <w:commentRangeEnd w:id="4"/>
+      <w:commentRangeEnd w:id="5"/>
       <w:r>
         <w:rPr>
           <w:rStyle w:val="Refdecomentario"/>
           <w:sz w:val="20"/>
           <w:szCs w:val="20"/>
         </w:rPr>
-        <w:commentReference w:id="4"/>
+        <w:commentReference w:id="5"/>
       </w:r>
       <w:r>
         <w:rPr>
@@ -2304,7 +2317,7 @@
         </w:rPr>
         <w:t xml:space="preserve">Figura 1. Aves </w:t>
       </w:r>
-      <w:commentRangeStart w:id="5"/>
+      <w:commentRangeStart w:id="6"/>
       <w:r>
         <w:rPr>
           <w:b/>
@@ -2316,14 +2329,14 @@
         </w:rPr>
         <w:t>migratorias</w:t>
       </w:r>
-      <w:commentRangeEnd w:id="5"/>
+      <w:commentRangeEnd w:id="6"/>
       <w:r>
         <w:rPr>
           <w:rStyle w:val="Refdecomentario"/>
           <w:sz w:val="20"/>
           <w:szCs w:val="20"/>
         </w:rPr>
-        <w:commentReference w:id="5"/>
+        <w:commentReference w:id="6"/>
       </w:r>
     </w:p>
     <w:p>
@@ -2334,15 +2347,15 @@
           <w:szCs w:val="20"/>
         </w:rPr>
       </w:pPr>
-      <w:commentRangeStart w:id="6"/>
-      <w:commentRangeEnd w:id="6"/>
+      <w:commentRangeStart w:id="7"/>
+      <w:commentRangeEnd w:id="7"/>
       <w:r>
         <w:rPr>
           <w:rStyle w:val="Refdecomentario"/>
           <w:sz w:val="20"/>
           <w:szCs w:val="20"/>
         </w:rPr>
-        <w:commentReference w:id="6"/>
+        <w:commentReference w:id="7"/>
       </w:r>
       <w:r>
         <w:rPr>
@@ -2537,7 +2550,6 @@
           <w:sz w:val="20"/>
           <w:szCs w:val="20"/>
         </w:rPr>
-        <w:lastRenderedPageBreak/>
         <w:t>110 peces de agua dulce</w:t>
       </w:r>
     </w:p>
@@ -2559,6 +2571,7 @@
           <w:sz w:val="20"/>
           <w:szCs w:val="20"/>
         </w:rPr>
+        <w:lastRenderedPageBreak/>
         <w:t>64 peces marinos</w:t>
       </w:r>
     </w:p>
@@ -2871,7 +2884,7 @@
         </w:rPr>
         <w:t xml:space="preserve"> </w:t>
       </w:r>
-      <w:commentRangeStart w:id="7"/>
+      <w:commentRangeStart w:id="8"/>
       <w:r>
         <w:rPr>
           <w:b/>
@@ -2883,14 +2896,14 @@
         </w:rPr>
         <w:t>Colombia</w:t>
       </w:r>
-      <w:commentRangeEnd w:id="7"/>
+      <w:commentRangeEnd w:id="8"/>
       <w:r>
         <w:rPr>
           <w:rStyle w:val="Refdecomentario"/>
           <w:sz w:val="20"/>
           <w:szCs w:val="20"/>
         </w:rPr>
-        <w:commentReference w:id="7"/>
+        <w:commentReference w:id="8"/>
       </w:r>
     </w:p>
     <w:p>
@@ -2956,27 +2969,21 @@
     <w:p>
       <w:pPr>
         <w:spacing w:line="360" w:lineRule="auto"/>
-        <w:rPr>
-          <w:sz w:val="20"/>
-          <w:szCs w:val="20"/>
-        </w:rPr>
-      </w:pPr>
-      <w:r>
-        <w:rPr>
-          <w:b/>
+        <w:ind w:left="720" w:firstLine="720"/>
+        <w:rPr>
+          <w:bCs/>
+          <w:sz w:val="20"/>
+          <w:szCs w:val="20"/>
+        </w:rPr>
+      </w:pPr>
+      <w:r>
+        <w:rPr>
+          <w:bCs/>
           <w:color w:val="231F20"/>
           <w:sz w:val="20"/>
           <w:szCs w:val="20"/>
         </w:rPr>
-        <w:t xml:space="preserve">Fuente: </w:t>
-      </w:r>
-      <w:r>
-        <w:rPr>
-          <w:color w:val="231F20"/>
-          <w:sz w:val="20"/>
-          <w:szCs w:val="20"/>
-        </w:rPr>
-        <w:t>Sibcolombia.net (2017)</w:t>
+        <w:t>Fuente: Sibcolombia.net (2017)</w:t>
       </w:r>
     </w:p>
     <w:p>
@@ -3309,7 +3316,7 @@
         </w:rPr>
         <w:t xml:space="preserve"> </w:t>
       </w:r>
-      <w:commentRangeStart w:id="8"/>
+      <w:commentRangeStart w:id="9"/>
       <w:r>
         <w:rPr>
           <w:b/>
@@ -3321,14 +3328,14 @@
         </w:rPr>
         <w:t>especies</w:t>
       </w:r>
-      <w:commentRangeEnd w:id="8"/>
+      <w:commentRangeEnd w:id="9"/>
       <w:r>
         <w:rPr>
           <w:rStyle w:val="Refdecomentario"/>
           <w:sz w:val="20"/>
           <w:szCs w:val="20"/>
         </w:rPr>
-        <w:commentReference w:id="8"/>
+        <w:commentReference w:id="9"/>
       </w:r>
     </w:p>
     <w:p>
@@ -3405,7 +3412,9 @@
     <w:p>
       <w:pPr>
         <w:spacing w:line="360" w:lineRule="auto"/>
-        <w:rPr>
+        <w:ind w:firstLine="720"/>
+        <w:rPr>
+          <w:bCs/>
           <w:color w:val="231F20"/>
           <w:sz w:val="20"/>
           <w:szCs w:val="20"/>
@@ -3413,36 +3422,28 @@
       </w:pPr>
       <w:r>
         <w:rPr>
-          <w:b/>
+          <w:bCs/>
           <w:color w:val="231F20"/>
           <w:sz w:val="20"/>
           <w:szCs w:val="20"/>
         </w:rPr>
-        <w:t xml:space="preserve">Fuente: </w:t>
-      </w:r>
-      <w:r>
+        <w:t>Fuente: Sibcolombia.net (2017)</w:t>
+      </w:r>
+    </w:p>
+    <w:p>
+      <w:pPr>
+        <w:spacing w:line="360" w:lineRule="auto"/>
         <w:rPr>
           <w:color w:val="231F20"/>
           <w:sz w:val="20"/>
           <w:szCs w:val="20"/>
         </w:rPr>
-        <w:t>Sibcolombia.net (2017)</w:t>
-      </w:r>
+      </w:pPr>
     </w:p>
     <w:p>
       <w:pPr>
         <w:spacing w:line="360" w:lineRule="auto"/>
         <w:rPr>
-          <w:color w:val="231F20"/>
-          <w:sz w:val="20"/>
-          <w:szCs w:val="20"/>
-        </w:rPr>
-      </w:pPr>
-    </w:p>
-    <w:p>
-      <w:pPr>
-        <w:spacing w:line="360" w:lineRule="auto"/>
-        <w:rPr>
           <w:sz w:val="20"/>
           <w:szCs w:val="20"/>
         </w:rPr>
@@ -3463,15 +3464,6 @@
         </w:rPr>
         <w:t>Según el Ministerio de Medio Ambiente y Desarrollo Sostenible (2010), en Colombia existen 377 especies de fauna clasificadas como amenazadas. La distribución por grupos es la siguiente:</w:t>
       </w:r>
-    </w:p>
-    <w:p>
-      <w:pPr>
-        <w:spacing w:after="160" w:line="360" w:lineRule="auto"/>
-        <w:rPr>
-          <w:sz w:val="20"/>
-          <w:szCs w:val="20"/>
-        </w:rPr>
-      </w:pPr>
     </w:p>
     <w:p>
       <w:pPr>
@@ -3840,7 +3832,6 @@
           <w:sz w:val="20"/>
           <w:szCs w:val="20"/>
         </w:rPr>
-        <w:lastRenderedPageBreak/>
         <w:t>Colombia y el contexto mundial de la biodiversidad</w:t>
       </w:r>
     </w:p>
@@ -3871,6 +3862,7 @@
           <w:sz w:val="20"/>
           <w:szCs w:val="20"/>
         </w:rPr>
+        <w:lastRenderedPageBreak/>
         <w:t>La siguiente figura presenta los países denominados megadiversos, los cuales concentran, en conjunto, aproximadamente el 70</w:t>
       </w:r>
       <w:r>
@@ -4043,7 +4035,7 @@
         </w:rPr>
         <w:t xml:space="preserve"> </w:t>
       </w:r>
-      <w:commentRangeStart w:id="9"/>
+      <w:commentRangeStart w:id="10"/>
       <w:r>
         <w:rPr>
           <w:b/>
@@ -4054,14 +4046,14 @@
         </w:rPr>
         <w:t>mundo</w:t>
       </w:r>
-      <w:commentRangeEnd w:id="9"/>
+      <w:commentRangeEnd w:id="10"/>
       <w:r>
         <w:rPr>
           <w:rStyle w:val="Refdecomentario"/>
           <w:sz w:val="20"/>
           <w:szCs w:val="20"/>
         </w:rPr>
-        <w:commentReference w:id="9"/>
+        <w:commentReference w:id="10"/>
       </w:r>
     </w:p>
     <w:p>
@@ -4386,7 +4378,6 @@
           <w:szCs w:val="20"/>
           <w:lang w:val="es-ES" w:eastAsia="en-US"/>
         </w:rPr>
-        <w:lastRenderedPageBreak/>
         <w:t>Estos datos evidencian la extraordinaria diversidad biológica de Colombia y su importancia a nivel global en términos de biodiversidad.</w:t>
       </w:r>
     </w:p>
@@ -4416,6 +4407,7 @@
           <w:sz w:val="20"/>
           <w:szCs w:val="20"/>
         </w:rPr>
+        <w:lastRenderedPageBreak/>
         <w:t>Figura</w:t>
       </w:r>
       <w:r>
@@ -4513,7 +4505,7 @@
         </w:rPr>
         <w:t xml:space="preserve"> </w:t>
       </w:r>
-      <w:commentRangeStart w:id="10"/>
+      <w:commentRangeStart w:id="11"/>
       <w:r>
         <w:rPr>
           <w:b/>
@@ -4523,14 +4515,14 @@
         </w:rPr>
         <w:t>Colombia</w:t>
       </w:r>
-      <w:commentRangeEnd w:id="10"/>
+      <w:commentRangeEnd w:id="11"/>
       <w:r>
         <w:rPr>
           <w:rStyle w:val="Refdecomentario"/>
           <w:sz w:val="20"/>
           <w:szCs w:val="20"/>
         </w:rPr>
-        <w:commentReference w:id="10"/>
+        <w:commentReference w:id="11"/>
       </w:r>
     </w:p>
     <w:p>
@@ -4700,7 +4692,7 @@
         </w:rPr>
         <w:t xml:space="preserve">. Clasificación de la </w:t>
       </w:r>
-      <w:commentRangeStart w:id="11"/>
+      <w:commentRangeStart w:id="12"/>
       <w:r>
         <w:rPr>
           <w:b/>
@@ -4712,14 +4704,14 @@
         </w:rPr>
         <w:t>biodiversidad</w:t>
       </w:r>
-      <w:commentRangeEnd w:id="11"/>
+      <w:commentRangeEnd w:id="12"/>
       <w:r>
         <w:rPr>
           <w:rStyle w:val="Refdecomentario"/>
           <w:sz w:val="20"/>
           <w:szCs w:val="20"/>
         </w:rPr>
-        <w:commentReference w:id="11"/>
+        <w:commentReference w:id="12"/>
       </w:r>
     </w:p>
     <w:p>
@@ -4841,6 +4833,7 @@
           <w:szCs w:val="20"/>
           <w:lang w:eastAsia="es-CO"/>
         </w:rPr>
+        <w:lastRenderedPageBreak/>
         <w:t>¿Qué son los “</w:t>
       </w:r>
       <w:proofErr w:type="spellStart"/>
@@ -5024,7 +5017,7 @@
         </w:rPr>
         <w:t xml:space="preserve"> además de esta alta biodiversidad, el área debe haber sufrido una significativa pérdida de su hábitat natural debido a actividades humanas, como la deforestación, la expansión urbana o la agricultura </w:t>
       </w:r>
-      <w:commentRangeStart w:id="12"/>
+      <w:commentRangeStart w:id="13"/>
       <w:r>
         <w:rPr>
           <w:rFonts w:eastAsia="Times New Roman"/>
@@ -5034,14 +5027,14 @@
         </w:rPr>
         <w:t>intensiva</w:t>
       </w:r>
-      <w:commentRangeEnd w:id="12"/>
+      <w:commentRangeEnd w:id="13"/>
       <w:r>
         <w:rPr>
           <w:rStyle w:val="Refdecomentario"/>
           <w:sz w:val="20"/>
           <w:szCs w:val="20"/>
         </w:rPr>
-        <w:commentReference w:id="12"/>
+        <w:commentReference w:id="13"/>
       </w:r>
       <w:r>
         <w:rPr>
@@ -5455,7 +5448,6 @@
           <w:szCs w:val="20"/>
           <w:lang w:eastAsia="es-CO"/>
         </w:rPr>
-        <w:lastRenderedPageBreak/>
         <w:t>Islas de Melanesia del este</w:t>
       </w:r>
     </w:p>
@@ -5504,6 +5496,7 @@
           <w:szCs w:val="20"/>
           <w:lang w:eastAsia="es-CO"/>
         </w:rPr>
+        <w:lastRenderedPageBreak/>
         <w:t>Indochina-Birmania</w:t>
       </w:r>
     </w:p>
@@ -6186,7 +6179,6 @@
           <w:sz w:val="20"/>
           <w:szCs w:val="20"/>
         </w:rPr>
-        <w:lastRenderedPageBreak/>
         <w:t xml:space="preserve">Figura </w:t>
       </w:r>
       <w:r>
@@ -6276,7 +6268,7 @@
         </w:rPr>
         <w:t xml:space="preserve">el </w:t>
       </w:r>
-      <w:commentRangeStart w:id="13"/>
+      <w:commentRangeStart w:id="14"/>
       <w:r>
         <w:rPr>
           <w:rFonts w:eastAsia="Times New Roman"/>
@@ -6290,14 +6282,14 @@
         </w:rPr>
         <w:t>mundo</w:t>
       </w:r>
-      <w:commentRangeEnd w:id="13"/>
+      <w:commentRangeEnd w:id="14"/>
       <w:r>
         <w:rPr>
           <w:rStyle w:val="Refdecomentario"/>
           <w:sz w:val="20"/>
           <w:szCs w:val="20"/>
         </w:rPr>
-        <w:commentReference w:id="13"/>
+        <w:commentReference w:id="14"/>
       </w:r>
     </w:p>
     <w:p>
@@ -6314,6 +6306,7 @@
           <w:sz w:val="20"/>
           <w:szCs w:val="20"/>
         </w:rPr>
+        <w:lastRenderedPageBreak/>
         <w:drawing>
           <wp:inline distT="0" distB="0" distL="0" distR="0" wp14:anchorId="3F06BF78" wp14:editId="0B4A0EA0">
             <wp:extent cx="3951798" cy="2022265"/>
@@ -6354,8 +6347,9 @@
     <w:p>
       <w:pPr>
         <w:spacing w:before="18" w:line="360" w:lineRule="auto"/>
-        <w:ind w:left="118" w:right="105"/>
-        <w:rPr>
+        <w:ind w:left="118" w:right="105" w:firstLine="602"/>
+        <w:rPr>
+          <w:bCs/>
           <w:color w:val="231F20"/>
           <w:spacing w:val="-4"/>
           <w:sz w:val="20"/>
@@ -6364,7 +6358,7 @@
       </w:pPr>
       <w:r>
         <w:rPr>
-          <w:b/>
+          <w:bCs/>
           <w:color w:val="231F20"/>
           <w:sz w:val="20"/>
           <w:szCs w:val="20"/>
@@ -6373,6 +6367,7 @@
       </w:r>
       <w:r>
         <w:rPr>
+          <w:bCs/>
           <w:color w:val="231F20"/>
           <w:spacing w:val="-4"/>
           <w:sz w:val="20"/>
@@ -6457,7 +6452,7 @@
         </w:rPr>
         <w:t xml:space="preserve">“Tumbes-Chocó-Magdalena” y los “Andes </w:t>
       </w:r>
-      <w:commentRangeStart w:id="14"/>
+      <w:commentRangeStart w:id="15"/>
       <w:r>
         <w:rPr>
           <w:b/>
@@ -6467,14 +6462,14 @@
         </w:rPr>
         <w:t>Tropicales</w:t>
       </w:r>
-      <w:commentRangeEnd w:id="14"/>
+      <w:commentRangeEnd w:id="15"/>
       <w:r>
         <w:rPr>
           <w:rStyle w:val="Refdecomentario"/>
           <w:sz w:val="20"/>
           <w:szCs w:val="20"/>
         </w:rPr>
-        <w:commentReference w:id="14"/>
+        <w:commentReference w:id="15"/>
       </w:r>
       <w:r>
         <w:rPr>
@@ -6612,7 +6607,7 @@
         </w:rPr>
         <w:t>Tumbes-Choco-</w:t>
       </w:r>
-      <w:commentRangeStart w:id="15"/>
+      <w:commentRangeStart w:id="16"/>
       <w:r>
         <w:rPr>
           <w:b/>
@@ -6624,14 +6619,14 @@
         </w:rPr>
         <w:t>Magdalena</w:t>
       </w:r>
-      <w:commentRangeEnd w:id="15"/>
+      <w:commentRangeEnd w:id="16"/>
       <w:r>
         <w:rPr>
           <w:rStyle w:val="Refdecomentario"/>
           <w:sz w:val="20"/>
           <w:szCs w:val="20"/>
         </w:rPr>
-        <w:commentReference w:id="15"/>
+        <w:commentReference w:id="16"/>
       </w:r>
       <w:r>
         <w:rPr>
@@ -6869,7 +6864,7 @@
         </w:rPr>
         <w:t xml:space="preserve">. Los Andes </w:t>
       </w:r>
-      <w:commentRangeStart w:id="16"/>
+      <w:commentRangeStart w:id="17"/>
       <w:r>
         <w:rPr>
           <w:b/>
@@ -6881,14 +6876,14 @@
         </w:rPr>
         <w:t>Tropicales</w:t>
       </w:r>
-      <w:commentRangeEnd w:id="16"/>
+      <w:commentRangeEnd w:id="17"/>
       <w:r>
         <w:rPr>
           <w:rStyle w:val="Refdecomentario"/>
           <w:sz w:val="20"/>
           <w:szCs w:val="20"/>
         </w:rPr>
-        <w:commentReference w:id="16"/>
+        <w:commentReference w:id="17"/>
       </w:r>
     </w:p>
     <w:p>
@@ -6906,13 +6901,14 @@
         <w:spacing w:before="49" w:line="360" w:lineRule="auto"/>
         <w:ind w:left="996" w:right="1410" w:hanging="198"/>
         <w:rPr>
-          <w:sz w:val="20"/>
-          <w:szCs w:val="20"/>
-        </w:rPr>
-      </w:pPr>
-      <w:r>
-        <w:rPr>
-          <w:b/>
+          <w:bCs/>
+          <w:sz w:val="20"/>
+          <w:szCs w:val="20"/>
+        </w:rPr>
+      </w:pPr>
+      <w:r>
+        <w:rPr>
+          <w:bCs/>
           <w:sz w:val="20"/>
           <w:szCs w:val="20"/>
         </w:rPr>
@@ -6921,6 +6917,7 @@
       <w:proofErr w:type="spellStart"/>
       <w:r>
         <w:rPr>
+          <w:bCs/>
           <w:sz w:val="20"/>
           <w:szCs w:val="20"/>
         </w:rPr>
@@ -6929,6 +6926,7 @@
       <w:proofErr w:type="spellEnd"/>
       <w:r>
         <w:rPr>
+          <w:bCs/>
           <w:sz w:val="20"/>
           <w:szCs w:val="20"/>
         </w:rPr>
@@ -7049,8 +7047,8 @@
         </w:rPr>
         <w:t xml:space="preserve"> </w:t>
       </w:r>
-      <w:commentRangeStart w:id="17"/>
       <w:commentRangeStart w:id="18"/>
+      <w:commentRangeStart w:id="19"/>
       <w:r>
         <w:rPr>
           <w:b/>
@@ -7064,23 +7062,23 @@
         </w:rPr>
         <w:t>colombianos</w:t>
       </w:r>
-      <w:commentRangeEnd w:id="17"/>
+      <w:commentRangeEnd w:id="18"/>
       <w:r>
         <w:rPr>
           <w:rStyle w:val="Refdecomentario"/>
           <w:sz w:val="20"/>
           <w:szCs w:val="20"/>
         </w:rPr>
-        <w:commentReference w:id="17"/>
-      </w:r>
-      <w:commentRangeEnd w:id="18"/>
+        <w:commentReference w:id="18"/>
+      </w:r>
+      <w:commentRangeEnd w:id="19"/>
       <w:r>
         <w:rPr>
           <w:rStyle w:val="Refdecomentario"/>
           <w:sz w:val="20"/>
           <w:szCs w:val="20"/>
         </w:rPr>
-        <w:commentReference w:id="18"/>
+        <w:commentReference w:id="19"/>
       </w:r>
     </w:p>
     <w:p>
@@ -7472,6 +7470,7 @@
           <w:numId w:val="34"/>
         </w:numPr>
         <w:spacing w:line="360" w:lineRule="auto"/>
+        <w:ind w:left="284"/>
         <w:rPr>
           <w:b/>
           <w:bCs/>
@@ -7523,7 +7522,7 @@
           <w:lang w:eastAsia="es-CO"/>
         </w:rPr>
         <w:drawing>
-          <wp:anchor distT="0" distB="0" distL="114300" distR="114300" simplePos="0" relativeHeight="251662336" behindDoc="1" locked="0" layoutInCell="1" allowOverlap="1" wp14:anchorId="015BA27F" wp14:editId="207A5E43">
+          <wp:anchor distT="0" distB="0" distL="114300" distR="114300" simplePos="0" relativeHeight="251662336" behindDoc="1" locked="0" layoutInCell="1" allowOverlap="1" wp14:anchorId="015BA27F" wp14:editId="78072355">
             <wp:simplePos x="0" y="0"/>
             <wp:positionH relativeFrom="column">
               <wp:posOffset>3493908</wp:posOffset>
@@ -7606,7 +7605,7 @@
         </w:rPr>
         <w:t xml:space="preserve">Los servicios ecosistémicos son los beneficios directos e indirectos que los seres humanos obtienen de la biodiversidad y de los ecosistemas, resultado de las complejas interacciones entre sus componentes, estructuras y funciones ecológicas (Ministerio de Ambiente y Desarrollo Sostenible, </w:t>
       </w:r>
-      <w:commentRangeStart w:id="19"/>
+      <w:commentRangeStart w:id="20"/>
       <w:r>
         <w:rPr>
           <w:rFonts w:eastAsia="Times New Roman"/>
@@ -7616,14 +7615,14 @@
         </w:rPr>
         <w:t>2010</w:t>
       </w:r>
-      <w:commentRangeEnd w:id="19"/>
+      <w:commentRangeEnd w:id="20"/>
       <w:r>
         <w:rPr>
           <w:rStyle w:val="Refdecomentario"/>
           <w:sz w:val="20"/>
           <w:szCs w:val="20"/>
         </w:rPr>
-        <w:commentReference w:id="19"/>
+        <w:commentReference w:id="20"/>
       </w:r>
       <w:r>
         <w:rPr>
@@ -7698,7 +7697,13 @@
     </w:p>
     <w:p>
       <w:pPr>
+        <w:pStyle w:val="Prrafodelista"/>
+        <w:numPr>
+          <w:ilvl w:val="0"/>
+          <w:numId w:val="36"/>
+        </w:numPr>
         <w:spacing w:before="100" w:beforeAutospacing="1" w:after="100" w:afterAutospacing="1" w:line="360" w:lineRule="auto"/>
+        <w:ind w:left="142"/>
         <w:rPr>
           <w:rFonts w:eastAsia="Times New Roman"/>
           <w:b/>
@@ -8535,17 +8540,18 @@
           <w:szCs w:val="20"/>
         </w:rPr>
       </w:pPr>
-      <w:commentRangeStart w:id="20"/>
-      <w:commentRangeEnd w:id="20"/>
+      <w:commentRangeStart w:id="21"/>
+      <w:commentRangeEnd w:id="21"/>
       <w:r>
         <w:rPr>
           <w:rStyle w:val="Refdecomentario"/>
         </w:rPr>
         <w:lastRenderedPageBreak/>
-        <w:commentReference w:id="20"/>
-      </w:r>
-      <w:r>
-        <w:rPr>
+        <w:commentReference w:id="21"/>
+      </w:r>
+      <w:r>
+        <w:rPr>
+          <w:noProof/>
           <w:sz w:val="20"/>
           <w:szCs w:val="20"/>
         </w:rPr>
@@ -8623,35 +8629,10 @@
       <w:pPr>
         <w:pStyle w:val="Normal0"/>
         <w:spacing w:line="360" w:lineRule="auto"/>
-        <w:ind w:left="426"/>
-        <w:rPr>
-          <w:color w:val="7F7F7F"/>
-          <w:sz w:val="20"/>
-          <w:szCs w:val="20"/>
-        </w:rPr>
-      </w:pPr>
-    </w:p>
-    <w:p>
-      <w:pPr>
-        <w:pStyle w:val="Normal0"/>
-        <w:spacing w:line="360" w:lineRule="auto"/>
-        <w:ind w:left="426"/>
-        <w:rPr>
-          <w:color w:val="7F7F7F"/>
-          <w:sz w:val="20"/>
-          <w:szCs w:val="20"/>
-        </w:rPr>
-      </w:pPr>
-    </w:p>
-    <w:p>
-      <w:pPr>
-        <w:pStyle w:val="Normal0"/>
-        <w:spacing w:line="360" w:lineRule="auto"/>
-        <w:rPr>
-          <w:b/>
-          <w:sz w:val="20"/>
-          <w:szCs w:val="20"/>
-          <w:u w:val="single"/>
+        <w:rPr>
+          <w:bCs/>
+          <w:sz w:val="20"/>
+          <w:szCs w:val="20"/>
         </w:rPr>
       </w:pPr>
     </w:p>
@@ -8995,6 +8976,7 @@
             </w:r>
           </w:p>
         </w:tc>
+        <w:commentRangeStart w:id="22"/>
         <w:tc>
           <w:tcPr>
             <w:tcW w:w="2519" w:type="dxa"/>
@@ -9016,18 +8998,36 @@
                 <w:szCs w:val="20"/>
               </w:rPr>
             </w:pPr>
-            <w:hyperlink r:id="rId31" w:history="1">
-              <w:r>
-                <w:rPr>
-                  <w:rStyle w:val="Hipervnculo"/>
-                  <w:b w:val="0"/>
-                  <w:bCs/>
-                  <w:sz w:val="20"/>
-                  <w:szCs w:val="20"/>
-                </w:rPr>
-                <w:t>https://youtu.be/Qh2nSdrrIMc</w:t>
-              </w:r>
-            </w:hyperlink>
+            <w:r>
+              <w:fldChar w:fldCharType="begin"/>
+            </w:r>
+            <w:r>
+              <w:instrText>HYPERLINK "https://youtu.be/Qh2nSdrrIMc"</w:instrText>
+            </w:r>
+            <w:r>
+              <w:fldChar w:fldCharType="separate"/>
+            </w:r>
+            <w:r>
+              <w:rPr>
+                <w:rStyle w:val="Hipervnculo"/>
+                <w:b w:val="0"/>
+                <w:bCs/>
+                <w:sz w:val="20"/>
+                <w:szCs w:val="20"/>
+              </w:rPr>
+              <w:t>https://youtu.be/Qh2nSdrrIMc</w:t>
+            </w:r>
+            <w:r>
+              <w:fldChar w:fldCharType="end"/>
+            </w:r>
+            <w:commentRangeEnd w:id="22"/>
+            <w:r>
+              <w:rPr>
+                <w:rStyle w:val="Refdecomentario"/>
+                <w:b w:val="0"/>
+              </w:rPr>
+              <w:commentReference w:id="22"/>
+            </w:r>
           </w:p>
         </w:tc>
       </w:tr>
@@ -9182,7 +9182,7 @@
                 <w:szCs w:val="20"/>
               </w:rPr>
             </w:pPr>
-            <w:hyperlink r:id="rId32" w:history="1">
+            <w:hyperlink r:id="rId31" w:history="1">
               <w:r>
                 <w:rPr>
                   <w:rStyle w:val="Hipervnculo"/>
@@ -10493,16 +10493,6 @@
         </w:rPr>
         <w:t xml:space="preserve">. </w:t>
       </w:r>
-      <w:hyperlink r:id="rId33" w:tgtFrame="_new" w:history="1">
-        <w:r>
-          <w:rPr>
-            <w:rStyle w:val="Hipervnculo"/>
-            <w:sz w:val="20"/>
-            <w:szCs w:val="20"/>
-          </w:rPr>
-          <w:t>https://www.minambiente.gov.co/</w:t>
-        </w:r>
-      </w:hyperlink>
     </w:p>
     <w:p>
       <w:pPr>
@@ -10612,7 +10602,7 @@
         </w:rPr>
         <w:t xml:space="preserve">. (27 de 12 de 2017). La biodiversidad en Cifras. </w:t>
       </w:r>
-      <w:hyperlink r:id="rId34" w:history="1">
+      <w:hyperlink r:id="rId32" w:history="1">
         <w:r>
           <w:rPr>
             <w:rStyle w:val="Hipervnculo"/>
@@ -11589,8 +11579,8 @@
       </w:r>
     </w:p>
     <w:sectPr>
-      <w:headerReference w:type="default" r:id="rId35"/>
-      <w:footerReference w:type="default" r:id="rId36"/>
+      <w:headerReference w:type="default" r:id="rId33"/>
+      <w:footerReference w:type="default" r:id="rId34"/>
       <w:pgSz w:w="12240" w:h="15840"/>
       <w:pgMar w:top="1701" w:right="1134" w:bottom="1134" w:left="1134" w:header="720" w:footer="0" w:gutter="0"/>
       <w:pgNumType w:start="1"/>
@@ -11602,7 +11592,7 @@
 
 <file path=word/comments.xml><?xml version="1.0" encoding="utf-8"?>
 <w:comments xmlns:wpc="http://schemas.microsoft.com/office/word/2010/wordprocessingCanvas" xmlns:cx="http://schemas.microsoft.com/office/drawing/2014/chartex" xmlns:cx1="http://schemas.microsoft.com/office/drawing/2015/9/8/chartex" xmlns:cx2="http://schemas.microsoft.com/office/drawing/2015/10/21/chartex" xmlns:cx3="http://schemas.microsoft.com/office/drawing/2016/5/9/chartex" xmlns:cx4="http://schemas.microsoft.com/office/drawing/2016/5/10/chartex" xmlns:cx5="http://schemas.microsoft.com/office/drawing/2016/5/11/chartex" xmlns:cx6="http://schemas.microsoft.com/office/drawing/2016/5/12/chartex" xmlns:cx7="http://schemas.microsoft.com/office/drawing/2016/5/13/chartex" xmlns:cx8="http://schemas.microsoft.com/office/drawing/2016/5/14/chartex" xmlns:mc="http://schemas.openxmlformats.org/markup-compatibility/2006" xmlns:aink="http://schemas.microsoft.com/office/drawing/2016/ink" xmlns:am3d="http://schemas.microsoft.com/office/drawing/2017/model3d" xmlns:o="urn:schemas-microsoft-com:office:office" xmlns:oel="http://schemas.microsoft.com/office/2019/extlst" xmlns:r="http://schemas.openxmlformats.org/officeDocument/2006/relationships" xmlns:m="http://schemas.openxmlformats.org/officeDocument/2006/math" xmlns:v="urn:schemas-microsoft-com:vml" xmlns:wp14="http://schemas.microsoft.com/office/word/2010/wordprocessingDrawing" xmlns:wp="http://schemas.openxmlformats.org/drawingml/2006/wordprocessingDrawing" xmlns:w10="urn:schemas-microsoft-com:office:word" xmlns:w="http://schemas.openxmlformats.org/wordprocessingml/2006/main" xmlns:w14="http://schemas.microsoft.com/office/word/2010/wordml" xmlns:w15="http://schemas.microsoft.com/office/word/2012/wordml" xmlns:w16cex="http://schemas.microsoft.com/office/word/2018/wordml/cex" xmlns:w16cid="http://schemas.microsoft.com/office/word/2016/wordml/cid" xmlns:w16="http://schemas.microsoft.com/office/word/2018/wordml" xmlns:w16du="http://schemas.microsoft.com/office/word/2023/wordml/word16du" xmlns:w16sdtdh="http://schemas.microsoft.com/office/word/2020/wordml/sdtdatahash" xmlns:w16sdtfl="http://schemas.microsoft.com/office/word/2024/wordml/sdtformatlock" xmlns:w16se="http://schemas.microsoft.com/office/word/2015/wordml/symex" xmlns:wpg="http://schemas.microsoft.com/office/word/2010/wordprocessingGroup" xmlns:wpi="http://schemas.microsoft.com/office/word/2010/wordprocessingInk" xmlns:wne="http://schemas.microsoft.com/office/word/2006/wordml" xmlns:wps="http://schemas.microsoft.com/office/word/2010/wordprocessingShape" mc:Ignorable="w14 w15 w16se w16cid w16 w16cex w16sdtdh w16sdtfl w16du wp14">
-  <w:comment w:id="0" w:author="Sandra Paola Morales Paez" w:date="2025-04-10T11:39:00Z" w:initials="SM">
+  <w:comment w:id="0" w:author="Sandra Paola Morales Paez" w:date="2025-05-26T07:20:00Z" w:initials="SM">
     <w:p>
       <w:pPr>
         <w:pStyle w:val="Textocomentario"/>
@@ -11614,9 +11604,36 @@
         <w:annotationRef/>
       </w:r>
       <w:r>
+        <w:t xml:space="preserve">Enlace para elaborar Guin de video </w:t>
+      </w:r>
+      <w:hyperlink r:id="rId1" w:history="1">
+        <w:r>
+          <w:rPr>
+            <w:rStyle w:val="Hipervnculo"/>
+          </w:rPr>
+          <w:t>CF1_GUION_VIDEO INTRODUCCION_63310033.docx</w:t>
+        </w:r>
+      </w:hyperlink>
+      <w:r>
+        <w:t xml:space="preserve"> </w:t>
+      </w:r>
+    </w:p>
+  </w:comment>
+  <w:comment w:id="1" w:author="Sandra Paola Morales Paez" w:date="2025-04-10T11:39:00Z" w:initials="SM">
+    <w:p>
+      <w:pPr>
+        <w:pStyle w:val="Textocomentario"/>
+      </w:pPr>
+      <w:r>
+        <w:rPr>
+          <w:rStyle w:val="Refdecomentario"/>
+        </w:rPr>
+        <w:annotationRef/>
+      </w:r>
+      <w:r>
         <w:t xml:space="preserve">Se recomienda como imagen decorativa   </w:t>
       </w:r>
-      <w:hyperlink r:id="rId1" w:anchor="fromView=search&amp;page=1&amp;position=21&amp;uuid=31dc6f8e-0866-440f-a7d1-8f87045d4f23&amp;query=biodiversidad" w:history="1">
+      <w:hyperlink r:id="rId2" w:anchor="fromView=search&amp;page=1&amp;position=21&amp;uuid=31dc6f8e-0866-440f-a7d1-8f87045d4f23&amp;query=biodiversidad" w:history="1">
         <w:r>
           <w:rPr>
             <w:rStyle w:val="Hipervnculo"/>
@@ -11626,7 +11643,7 @@
       </w:hyperlink>
     </w:p>
   </w:comment>
-  <w:comment w:id="1" w:author="Sandra Paola Morales Paez" w:date="2025-04-10T11:37:00Z" w:initials="SM">
+  <w:comment w:id="2" w:author="Sandra Paola Morales Paez" w:date="2025-04-10T11:37:00Z" w:initials="SM">
     <w:p>
       <w:pPr>
         <w:pStyle w:val="Textocomentario"/>
@@ -11640,7 +11657,7 @@
       <w:r>
         <w:t xml:space="preserve">Imagen de referencia para decoración de este punto   </w:t>
       </w:r>
-      <w:hyperlink r:id="rId2" w:anchor="fromView=image_search_similar&amp;page=1&amp;position=30&amp;uuid=a7f7930d-20f4-4081-b0b1-e9447ed72f0b&amp;query=%E2%80%A2%09Ecosistemas+y+h%C3%A1bitats" w:history="1">
+      <w:hyperlink r:id="rId3" w:anchor="fromView=image_search_similar&amp;page=1&amp;position=30&amp;uuid=a7f7930d-20f4-4081-b0b1-e9447ed72f0b&amp;query=%E2%80%A2%09Ecosistemas+y+h%C3%A1bitats" w:history="1">
         <w:r>
           <w:rPr>
             <w:rStyle w:val="Hipervnculo"/>
@@ -11650,7 +11667,7 @@
       </w:hyperlink>
     </w:p>
   </w:comment>
-  <w:comment w:id="2" w:author="Sandra Paola Morales Paez" w:date="2025-04-10T11:27:00Z" w:initials="SM">
+  <w:comment w:id="3" w:author="Sandra Paola Morales Paez" w:date="2025-04-10T11:27:00Z" w:initials="SM">
     <w:p>
       <w:pPr>
         <w:pStyle w:val="Textocomentario"/>
@@ -11666,7 +11683,7 @@
       </w:r>
     </w:p>
   </w:comment>
-  <w:comment w:id="3" w:author="Sandra Paola Morales Paez" w:date="2025-04-10T11:31:00Z" w:initials="SM">
+  <w:comment w:id="4" w:author="Sandra Paola Morales Paez" w:date="2025-04-10T11:31:00Z" w:initials="SM">
     <w:p>
       <w:pPr>
         <w:pStyle w:val="Textocomentario"/>
@@ -11682,7 +11699,7 @@
       </w:r>
     </w:p>
   </w:comment>
-  <w:comment w:id="4" w:author="Sandra Paola Morales Paez" w:date="2025-04-08T10:04:00Z" w:initials="SM">
+  <w:comment w:id="5" w:author="Sandra Paola Morales Paez" w:date="2025-04-08T10:04:00Z" w:initials="SM">
     <w:p>
       <w:pPr>
         <w:pStyle w:val="Textocomentario"/>
@@ -11698,7 +11715,7 @@
       </w:r>
     </w:p>
   </w:comment>
-  <w:comment w:id="5" w:author="Sandra Paola Morales Paez" w:date="2025-04-08T11:12:00Z" w:initials="SM">
+  <w:comment w:id="6" w:author="Sandra Paola Morales Paez" w:date="2025-04-08T11:12:00Z" w:initials="SM">
     <w:p>
       <w:pPr>
         <w:pStyle w:val="Textocomentario"/>
@@ -11722,7 +11739,7 @@
       </w:r>
     </w:p>
   </w:comment>
-  <w:comment w:id="6" w:author="Sandra Paola Morales Paez" w:date="2025-04-08T11:10:00Z" w:initials="SM">
+  <w:comment w:id="7" w:author="Sandra Paola Morales Paez" w:date="2025-04-08T11:10:00Z" w:initials="SM">
     <w:p>
       <w:pPr>
         <w:pStyle w:val="Textocomentario"/>
@@ -11733,7 +11750,7 @@
         </w:rPr>
         <w:annotationRef/>
       </w:r>
-      <w:hyperlink r:id="rId3" w:anchor="fromView=search&amp;page=1&amp;position=18&amp;uuid=a6fafb42-b6b2-4c7b-a4e6-575993a0f580&amp;query=aves+migratorias" w:history="1">
+      <w:hyperlink r:id="rId4" w:anchor="fromView=search&amp;page=1&amp;position=18&amp;uuid=a6fafb42-b6b2-4c7b-a4e6-575993a0f580&amp;query=aves+migratorias" w:history="1">
         <w:r>
           <w:rPr>
             <w:rStyle w:val="Hipervnculo"/>
@@ -11743,7 +11760,7 @@
       </w:hyperlink>
     </w:p>
   </w:comment>
-  <w:comment w:id="7" w:author="Sandra Paola Morales Paez" w:date="2025-04-08T11:01:00Z" w:initials="SM">
+  <w:comment w:id="8" w:author="Sandra Paola Morales Paez" w:date="2025-04-08T11:01:00Z" w:initials="SM">
     <w:p>
       <w:pPr>
         <w:pStyle w:val="Textocomentario"/>
@@ -11767,7 +11784,7 @@
       </w:r>
     </w:p>
   </w:comment>
-  <w:comment w:id="8" w:author="Sandra Paola Morales Paez" w:date="2025-04-08T11:07:00Z" w:initials="SM">
+  <w:comment w:id="9" w:author="Sandra Paola Morales Paez" w:date="2025-04-08T11:07:00Z" w:initials="SM">
     <w:p>
       <w:pPr>
         <w:pStyle w:val="Textocomentario"/>
@@ -11791,7 +11808,7 @@
       </w:r>
     </w:p>
   </w:comment>
-  <w:comment w:id="9" w:author="Sandra Paola Morales Paez" w:date="2025-04-08T12:03:00Z" w:initials="SM">
+  <w:comment w:id="10" w:author="Sandra Paola Morales Paez" w:date="2025-04-08T12:03:00Z" w:initials="SM">
     <w:p>
       <w:pPr>
         <w:pStyle w:val="Textocomentario"/>
@@ -11815,7 +11832,7 @@
       </w:r>
     </w:p>
   </w:comment>
-  <w:comment w:id="10" w:author="Sandra Paola Morales Paez" w:date="2025-04-10T14:38:00Z" w:initials="SM">
+  <w:comment w:id="11" w:author="Sandra Paola Morales Paez" w:date="2025-04-10T14:38:00Z" w:initials="SM">
     <w:p>
       <w:pPr>
         <w:pStyle w:val="Textocomentario"/>
@@ -11839,7 +11856,7 @@
       </w:r>
     </w:p>
   </w:comment>
-  <w:comment w:id="11" w:author="Sandra Paola Morales Paez" w:date="2025-04-10T14:39:00Z" w:initials="SM">
+  <w:comment w:id="12" w:author="Sandra Paola Morales Paez" w:date="2025-04-10T14:39:00Z" w:initials="SM">
     <w:p>
       <w:pPr>
         <w:pStyle w:val="Textocomentario"/>
@@ -11863,7 +11880,7 @@
       </w:r>
     </w:p>
   </w:comment>
-  <w:comment w:id="12" w:author="Sandra Paola Morales Paez" w:date="2025-04-10T14:45:00Z" w:initials="SM">
+  <w:comment w:id="13" w:author="Sandra Paola Morales Paez" w:date="2025-04-10T14:45:00Z" w:initials="SM">
     <w:p>
       <w:pPr>
         <w:pStyle w:val="Textocomentario"/>
@@ -11877,7 +11894,7 @@
       <w:r>
         <w:t xml:space="preserve">Imagen decorativa de referencia: </w:t>
       </w:r>
-      <w:hyperlink r:id="rId4" w:anchor="fromView=search&amp;page=1&amp;position=5&amp;uuid=097c295a-634c-4c00-acdb-1b92a4455460&amp;query=Los+hotspots+de+biodiversidad+colombia" w:history="1">
+      <w:hyperlink r:id="rId5" w:anchor="fromView=search&amp;page=1&amp;position=5&amp;uuid=097c295a-634c-4c00-acdb-1b92a4455460&amp;query=Los+hotspots+de+biodiversidad+colombia" w:history="1">
         <w:r>
           <w:rPr>
             <w:rStyle w:val="Hipervnculo"/>
@@ -11887,7 +11904,7 @@
       </w:hyperlink>
     </w:p>
   </w:comment>
-  <w:comment w:id="13" w:author="Sandra Paola Morales Paez" w:date="2025-04-10T14:53:00Z" w:initials="SM">
+  <w:comment w:id="14" w:author="Sandra Paola Morales Paez" w:date="2025-04-10T14:53:00Z" w:initials="SM">
     <w:p>
       <w:pPr>
         <w:pStyle w:val="Textocomentario"/>
@@ -11911,7 +11928,7 @@
       </w:r>
     </w:p>
   </w:comment>
-  <w:comment w:id="14" w:author="Sandra Paola Morales Paez" w:date="2025-04-10T14:55:00Z" w:initials="SM">
+  <w:comment w:id="15" w:author="Sandra Paola Morales Paez" w:date="2025-04-10T14:55:00Z" w:initials="SM">
     <w:p>
       <w:pPr>
         <w:pStyle w:val="Textocomentario"/>
@@ -11927,7 +11944,7 @@
       </w:r>
     </w:p>
   </w:comment>
-  <w:comment w:id="15" w:author="Sandra Paola Morales Paez" w:date="2025-04-10T15:03:00Z" w:initials="SM">
+  <w:comment w:id="16" w:author="Sandra Paola Morales Paez" w:date="2025-04-10T15:03:00Z" w:initials="SM">
     <w:p>
       <w:pPr>
         <w:pStyle w:val="Textocomentario"/>
@@ -11951,7 +11968,7 @@
       </w:r>
     </w:p>
   </w:comment>
-  <w:comment w:id="16" w:author="Sandra Paola Morales Paez" w:date="2025-04-10T15:06:00Z" w:initials="SM">
+  <w:comment w:id="17" w:author="Sandra Paola Morales Paez" w:date="2025-04-10T15:06:00Z" w:initials="SM">
     <w:p>
       <w:pPr>
         <w:pStyle w:val="Textocomentario"/>
@@ -11975,7 +11992,7 @@
       </w:r>
     </w:p>
   </w:comment>
-  <w:comment w:id="17" w:author="Sandra Paola Morales Paez" w:date="2025-04-10T15:09:00Z" w:initials="SM">
+  <w:comment w:id="18" w:author="Sandra Paola Morales Paez" w:date="2025-04-10T15:09:00Z" w:initials="SM">
     <w:p>
       <w:pPr>
         <w:pStyle w:val="Textocomentario"/>
@@ -11991,7 +12008,7 @@
       </w:r>
     </w:p>
   </w:comment>
-  <w:comment w:id="18" w:author="Sandra Paola Morales Paez" w:date="2025-04-10T15:10:00Z" w:initials="SM">
+  <w:comment w:id="19" w:author="Sandra Paola Morales Paez" w:date="2025-04-10T15:10:00Z" w:initials="SM">
     <w:p>
       <w:pPr>
         <w:pStyle w:val="Textocomentario"/>
@@ -12015,7 +12032,7 @@
       </w:r>
     </w:p>
   </w:comment>
-  <w:comment w:id="19" w:author="Sandra Paola Morales Paez" w:date="2025-04-10T15:32:00Z" w:initials="SM">
+  <w:comment w:id="20" w:author="Sandra Paola Morales Paez" w:date="2025-04-10T15:32:00Z" w:initials="SM">
     <w:p>
       <w:pPr>
         <w:pStyle w:val="Textocomentario"/>
@@ -12029,7 +12046,7 @@
       <w:r>
         <w:t xml:space="preserve">Se sugiere como imagen decorativa de referencia </w:t>
       </w:r>
-      <w:hyperlink r:id="rId5" w:anchor="fromView=search&amp;page=1&amp;position=9&amp;uuid=f7c09847-4c3e-4634-a5ee-a31ff0274002&amp;query=Los+servicios+ecosist%C3%A9micos++colombia" w:history="1">
+      <w:hyperlink r:id="rId6" w:anchor="fromView=search&amp;page=1&amp;position=9&amp;uuid=f7c09847-4c3e-4634-a5ee-a31ff0274002&amp;query=Los+servicios+ecosist%C3%A9micos++colombia" w:history="1">
         <w:r>
           <w:rPr>
             <w:rStyle w:val="Hipervnculo"/>
@@ -12039,7 +12056,7 @@
       </w:hyperlink>
     </w:p>
   </w:comment>
-  <w:comment w:id="20" w:author="Sandra Paola Morales Paez" w:date="2025-04-10T20:07:00Z" w:initials="SM">
+  <w:comment w:id="21" w:author="Sandra Paola Morales Paez" w:date="2025-04-10T20:07:00Z" w:initials="SM">
     <w:p>
       <w:pPr>
         <w:pStyle w:val="Textocomentario"/>
@@ -12060,6 +12077,22 @@
       </w:pPr>
       <w:r>
         <w:t xml:space="preserve">La síntesis aborda la relación entre biodiversidad y turismo sostenible, destacando componentes biológicos y su impacto en Colombia. Incluye la concentración de especies en regiones prioritarias, los efectos del cambio climático y la clasificación de los servicios ecosistémicos, así como categorías clave como ecosistemas, hábitats y especies en riesgo. </w:t>
+      </w:r>
+    </w:p>
+  </w:comment>
+  <w:comment w:id="22" w:author="Sandra Paola Morales Paez" w:date="2025-05-26T07:42:00Z" w:initials="SM">
+    <w:p>
+      <w:pPr>
+        <w:pStyle w:val="Textocomentario"/>
+      </w:pPr>
+      <w:r>
+        <w:rPr>
+          <w:rStyle w:val="Refdecomentario"/>
+        </w:rPr>
+        <w:annotationRef/>
+      </w:r>
+      <w:r>
+        <w:t>Ajustar cortinillas actualizadas de SENA</w:t>
       </w:r>
     </w:p>
   </w:comment>
@@ -12068,6 +12101,7 @@
 
 <file path=word/commentsExtended.xml><?xml version="1.0" encoding="utf-8"?>
 <w15:commentsEx xmlns:wpc="http://schemas.microsoft.com/office/word/2010/wordprocessingCanvas" xmlns:cx="http://schemas.microsoft.com/office/drawing/2014/chartex" xmlns:cx1="http://schemas.microsoft.com/office/drawing/2015/9/8/chartex" xmlns:cx2="http://schemas.microsoft.com/office/drawing/2015/10/21/chartex" xmlns:cx3="http://schemas.microsoft.com/office/drawing/2016/5/9/chartex" xmlns:cx4="http://schemas.microsoft.com/office/drawing/2016/5/10/chartex" xmlns:cx5="http://schemas.microsoft.com/office/drawing/2016/5/11/chartex" xmlns:cx6="http://schemas.microsoft.com/office/drawing/2016/5/12/chartex" xmlns:cx7="http://schemas.microsoft.com/office/drawing/2016/5/13/chartex" xmlns:cx8="http://schemas.microsoft.com/office/drawing/2016/5/14/chartex" xmlns:mc="http://schemas.openxmlformats.org/markup-compatibility/2006" xmlns:aink="http://schemas.microsoft.com/office/drawing/2016/ink" xmlns:am3d="http://schemas.microsoft.com/office/drawing/2017/model3d" xmlns:o="urn:schemas-microsoft-com:office:office" xmlns:oel="http://schemas.microsoft.com/office/2019/extlst" xmlns:r="http://schemas.openxmlformats.org/officeDocument/2006/relationships" xmlns:m="http://schemas.openxmlformats.org/officeDocument/2006/math" xmlns:v="urn:schemas-microsoft-com:vml" xmlns:wp14="http://schemas.microsoft.com/office/word/2010/wordprocessingDrawing" xmlns:wp="http://schemas.openxmlformats.org/drawingml/2006/wordprocessingDrawing" xmlns:w10="urn:schemas-microsoft-com:office:word" xmlns:w="http://schemas.openxmlformats.org/wordprocessingml/2006/main" xmlns:w14="http://schemas.microsoft.com/office/word/2010/wordml" xmlns:w15="http://schemas.microsoft.com/office/word/2012/wordml" xmlns:w16cex="http://schemas.microsoft.com/office/word/2018/wordml/cex" xmlns:w16cid="http://schemas.microsoft.com/office/word/2016/wordml/cid" xmlns:w16="http://schemas.microsoft.com/office/word/2018/wordml" xmlns:w16du="http://schemas.microsoft.com/office/word/2023/wordml/word16du" xmlns:w16sdtdh="http://schemas.microsoft.com/office/word/2020/wordml/sdtdatahash" xmlns:w16sdtfl="http://schemas.microsoft.com/office/word/2024/wordml/sdtformatlock" xmlns:w16se="http://schemas.microsoft.com/office/word/2015/wordml/symex" xmlns:wpg="http://schemas.microsoft.com/office/word/2010/wordprocessingGroup" xmlns:wpi="http://schemas.microsoft.com/office/word/2010/wordprocessingInk" xmlns:wne="http://schemas.microsoft.com/office/word/2006/wordml" xmlns:wps="http://schemas.microsoft.com/office/word/2010/wordprocessingShape" mc:Ignorable="w14 w15 w16se w16cid w16 w16cex w16sdtdh w16sdtfl w16du wp14">
+  <w15:commentEx w15:paraId="141142FF" w15:done="0"/>
   <w15:commentEx w15:paraId="2AE2B4F9" w15:done="0"/>
   <w15:commentEx w15:paraId="50E85BA6" w15:done="0"/>
   <w15:commentEx w15:paraId="2005D751" w15:done="0"/>
@@ -12089,11 +12123,13 @@
   <w15:commentEx w15:paraId="4A2FB781" w15:paraIdParent="0D6924B5" w15:done="0"/>
   <w15:commentEx w15:paraId="716C7BA4" w15:done="0"/>
   <w15:commentEx w15:paraId="723B7B2F" w15:done="0"/>
+  <w15:commentEx w15:paraId="7CEE2E3D" w15:done="0"/>
 </w15:commentsEx>
 </file>
 
 <file path=word/commentsExtensible.xml><?xml version="1.0" encoding="utf-8"?>
 <w16cex:commentsExtensible xmlns:wpc="http://schemas.microsoft.com/office/word/2010/wordprocessingCanvas" xmlns:cx="http://schemas.microsoft.com/office/drawing/2014/chartex" xmlns:cx1="http://schemas.microsoft.com/office/drawing/2015/9/8/chartex" xmlns:cx2="http://schemas.microsoft.com/office/drawing/2015/10/21/chartex" xmlns:cx3="http://schemas.microsoft.com/office/drawing/2016/5/9/chartex" xmlns:cx4="http://schemas.microsoft.com/office/drawing/2016/5/10/chartex" xmlns:cx5="http://schemas.microsoft.com/office/drawing/2016/5/11/chartex" xmlns:cx6="http://schemas.microsoft.com/office/drawing/2016/5/12/chartex" xmlns:cx7="http://schemas.microsoft.com/office/drawing/2016/5/13/chartex" xmlns:cx8="http://schemas.microsoft.com/office/drawing/2016/5/14/chartex" xmlns:cr="http://schemas.microsoft.com/office/comments/2020/reactions" xmlns:mc="http://schemas.openxmlformats.org/markup-compatibility/2006" xmlns:aink="http://schemas.microsoft.com/office/drawing/2016/ink" xmlns:am3d="http://schemas.microsoft.com/office/drawing/2017/model3d" xmlns:o="urn:schemas-microsoft-com:office:office" xmlns:oel="http://schemas.microsoft.com/office/2019/extlst" xmlns:r="http://schemas.openxmlformats.org/officeDocument/2006/relationships" xmlns:m="http://schemas.openxmlformats.org/officeDocument/2006/math" xmlns:v="urn:schemas-microsoft-com:vml" xmlns:wp14="http://schemas.microsoft.com/office/word/2010/wordprocessingDrawing" xmlns:wp="http://schemas.openxmlformats.org/drawingml/2006/wordprocessingDrawing" xmlns:w10="urn:schemas-microsoft-com:office:word" xmlns:w="http://schemas.openxmlformats.org/wordprocessingml/2006/main" xmlns:w14="http://schemas.microsoft.com/office/word/2010/wordml" xmlns:w15="http://schemas.microsoft.com/office/word/2012/wordml" xmlns:w16cex="http://schemas.microsoft.com/office/word/2018/wordml/cex" xmlns:w16cid="http://schemas.microsoft.com/office/word/2016/wordml/cid" xmlns:w16="http://schemas.microsoft.com/office/word/2018/wordml" xmlns:w16du="http://schemas.microsoft.com/office/word/2023/wordml/word16du" xmlns:w16sdtdh="http://schemas.microsoft.com/office/word/2020/wordml/sdtdatahash" xmlns:w16sdtfl="http://schemas.microsoft.com/office/word/2024/wordml/sdtformatlock" xmlns:w16se="http://schemas.microsoft.com/office/word/2015/wordml/symex" xmlns:wpg="http://schemas.microsoft.com/office/word/2010/wordprocessingGroup" xmlns:wpi="http://schemas.microsoft.com/office/word/2010/wordprocessingInk" xmlns:wne="http://schemas.microsoft.com/office/word/2006/wordml" xmlns:wps="http://schemas.microsoft.com/office/word/2010/wordprocessingShape" mc:Ignorable="w14 w15 w16se w16cid w16 w16cex w16sdtdh w16sdtfl cr w16du wp14">
+  <w16cex:commentExtensible w16cex:durableId="120F95FC" w16cex:dateUtc="2025-05-26T12:20:00Z"/>
   <w16cex:commentExtensible w16cex:durableId="394E22B4" w16cex:dateUtc="2025-04-10T16:39:00Z"/>
   <w16cex:commentExtensible w16cex:durableId="28881656" w16cex:dateUtc="2025-04-10T16:37:00Z"/>
   <w16cex:commentExtensible w16cex:durableId="7BC0E9BF" w16cex:dateUtc="2025-04-10T16:27:00Z"/>
@@ -12115,11 +12151,13 @@
   <w16cex:commentExtensible w16cex:durableId="2CAA3140" w16cex:dateUtc="2025-04-10T20:10:00Z"/>
   <w16cex:commentExtensible w16cex:durableId="0FDD6F7F" w16cex:dateUtc="2025-04-10T20:32:00Z"/>
   <w16cex:commentExtensible w16cex:durableId="22BA29B0" w16cex:dateUtc="2025-04-11T01:07:00Z"/>
+  <w16cex:commentExtensible w16cex:durableId="6D78839F" w16cex:dateUtc="2025-05-26T12:42:00Z"/>
 </w16cex:commentsExtensible>
 </file>
 
 <file path=word/commentsIds.xml><?xml version="1.0" encoding="utf-8"?>
 <w16cid:commentsIds xmlns:wpc="http://schemas.microsoft.com/office/word/2010/wordprocessingCanvas" xmlns:cx="http://schemas.microsoft.com/office/drawing/2014/chartex" xmlns:cx1="http://schemas.microsoft.com/office/drawing/2015/9/8/chartex" xmlns:cx2="http://schemas.microsoft.com/office/drawing/2015/10/21/chartex" xmlns:cx3="http://schemas.microsoft.com/office/drawing/2016/5/9/chartex" xmlns:cx4="http://schemas.microsoft.com/office/drawing/2016/5/10/chartex" xmlns:cx5="http://schemas.microsoft.com/office/drawing/2016/5/11/chartex" xmlns:cx6="http://schemas.microsoft.com/office/drawing/2016/5/12/chartex" xmlns:cx7="http://schemas.microsoft.com/office/drawing/2016/5/13/chartex" xmlns:cx8="http://schemas.microsoft.com/office/drawing/2016/5/14/chartex" xmlns:mc="http://schemas.openxmlformats.org/markup-compatibility/2006" xmlns:aink="http://schemas.microsoft.com/office/drawing/2016/ink" xmlns:am3d="http://schemas.microsoft.com/office/drawing/2017/model3d" xmlns:o="urn:schemas-microsoft-com:office:office" xmlns:oel="http://schemas.microsoft.com/office/2019/extlst" xmlns:r="http://schemas.openxmlformats.org/officeDocument/2006/relationships" xmlns:m="http://schemas.openxmlformats.org/officeDocument/2006/math" xmlns:v="urn:schemas-microsoft-com:vml" xmlns:wp14="http://schemas.microsoft.com/office/word/2010/wordprocessingDrawing" xmlns:wp="http://schemas.openxmlformats.org/drawingml/2006/wordprocessingDrawing" xmlns:w10="urn:schemas-microsoft-com:office:word" xmlns:w="http://schemas.openxmlformats.org/wordprocessingml/2006/main" xmlns:w14="http://schemas.microsoft.com/office/word/2010/wordml" xmlns:w15="http://schemas.microsoft.com/office/word/2012/wordml" xmlns:w16cex="http://schemas.microsoft.com/office/word/2018/wordml/cex" xmlns:w16cid="http://schemas.microsoft.com/office/word/2016/wordml/cid" xmlns:w16="http://schemas.microsoft.com/office/word/2018/wordml" xmlns:w16du="http://schemas.microsoft.com/office/word/2023/wordml/word16du" xmlns:w16sdtdh="http://schemas.microsoft.com/office/word/2020/wordml/sdtdatahash" xmlns:w16sdtfl="http://schemas.microsoft.com/office/word/2024/wordml/sdtformatlock" xmlns:w16se="http://schemas.microsoft.com/office/word/2015/wordml/symex" xmlns:wpg="http://schemas.microsoft.com/office/word/2010/wordprocessingGroup" xmlns:wpi="http://schemas.microsoft.com/office/word/2010/wordprocessingInk" xmlns:wne="http://schemas.microsoft.com/office/word/2006/wordml" xmlns:wps="http://schemas.microsoft.com/office/word/2010/wordprocessingShape" mc:Ignorable="w14 w15 w16se w16cid w16 w16cex w16sdtdh w16sdtfl w16du wp14">
+  <w16cid:commentId w16cid:paraId="141142FF" w16cid:durableId="120F95FC"/>
   <w16cid:commentId w16cid:paraId="2AE2B4F9" w16cid:durableId="394E22B4"/>
   <w16cid:commentId w16cid:paraId="50E85BA6" w16cid:durableId="28881656"/>
   <w16cid:commentId w16cid:paraId="2005D751" w16cid:durableId="7BC0E9BF"/>
@@ -12141,6 +12179,7 @@
   <w16cid:commentId w16cid:paraId="4A2FB781" w16cid:durableId="2CAA3140"/>
   <w16cid:commentId w16cid:paraId="716C7BA4" w16cid:durableId="0FDD6F7F"/>
   <w16cid:commentId w16cid:paraId="723B7B2F" w16cid:durableId="22BA29B0"/>
+  <w16cid:commentId w16cid:paraId="7CEE2E3D" w16cid:durableId="6D78839F"/>
 </w16cid:commentsIds>
 </file>
 
@@ -13018,6 +13057,119 @@
     </w:lvl>
   </w:abstractNum>
   <w:abstractNum w:abstractNumId="6" w15:restartNumberingAfterBreak="0">
+    <w:nsid w:val="136D0199"/>
+    <w:multiLevelType w:val="hybridMultilevel"/>
+    <w:tmpl w:val="FAA67258"/>
+    <w:lvl w:ilvl="0" w:tplc="240A0001">
+      <w:start w:val="1"/>
+      <w:numFmt w:val="bullet"/>
+      <w:lvlText w:val=""/>
+      <w:lvlJc w:val="left"/>
+      <w:pPr>
+        <w:ind w:left="720" w:hanging="360"/>
+      </w:pPr>
+      <w:rPr>
+        <w:rFonts w:ascii="Symbol" w:hAnsi="Symbol" w:hint="default"/>
+      </w:rPr>
+    </w:lvl>
+    <w:lvl w:ilvl="1" w:tplc="240A0003" w:tentative="1">
+      <w:start w:val="1"/>
+      <w:numFmt w:val="bullet"/>
+      <w:lvlText w:val="o"/>
+      <w:lvlJc w:val="left"/>
+      <w:pPr>
+        <w:ind w:left="1440" w:hanging="360"/>
+      </w:pPr>
+      <w:rPr>
+        <w:rFonts w:ascii="Courier New" w:hAnsi="Courier New" w:cs="Courier New" w:hint="default"/>
+      </w:rPr>
+    </w:lvl>
+    <w:lvl w:ilvl="2" w:tplc="240A0005" w:tentative="1">
+      <w:start w:val="1"/>
+      <w:numFmt w:val="bullet"/>
+      <w:lvlText w:val=""/>
+      <w:lvlJc w:val="left"/>
+      <w:pPr>
+        <w:ind w:left="2160" w:hanging="360"/>
+      </w:pPr>
+      <w:rPr>
+        <w:rFonts w:ascii="Wingdings" w:hAnsi="Wingdings" w:hint="default"/>
+      </w:rPr>
+    </w:lvl>
+    <w:lvl w:ilvl="3" w:tplc="240A0001" w:tentative="1">
+      <w:start w:val="1"/>
+      <w:numFmt w:val="bullet"/>
+      <w:lvlText w:val=""/>
+      <w:lvlJc w:val="left"/>
+      <w:pPr>
+        <w:ind w:left="2880" w:hanging="360"/>
+      </w:pPr>
+      <w:rPr>
+        <w:rFonts w:ascii="Symbol" w:hAnsi="Symbol" w:hint="default"/>
+      </w:rPr>
+    </w:lvl>
+    <w:lvl w:ilvl="4" w:tplc="240A0003" w:tentative="1">
+      <w:start w:val="1"/>
+      <w:numFmt w:val="bullet"/>
+      <w:lvlText w:val="o"/>
+      <w:lvlJc w:val="left"/>
+      <w:pPr>
+        <w:ind w:left="3600" w:hanging="360"/>
+      </w:pPr>
+      <w:rPr>
+        <w:rFonts w:ascii="Courier New" w:hAnsi="Courier New" w:cs="Courier New" w:hint="default"/>
+      </w:rPr>
+    </w:lvl>
+    <w:lvl w:ilvl="5" w:tplc="240A0005" w:tentative="1">
+      <w:start w:val="1"/>
+      <w:numFmt w:val="bullet"/>
+      <w:lvlText w:val=""/>
+      <w:lvlJc w:val="left"/>
+      <w:pPr>
+        <w:ind w:left="4320" w:hanging="360"/>
+      </w:pPr>
+      <w:rPr>
+        <w:rFonts w:ascii="Wingdings" w:hAnsi="Wingdings" w:hint="default"/>
+      </w:rPr>
+    </w:lvl>
+    <w:lvl w:ilvl="6" w:tplc="240A0001" w:tentative="1">
+      <w:start w:val="1"/>
+      <w:numFmt w:val="bullet"/>
+      <w:lvlText w:val=""/>
+      <w:lvlJc w:val="left"/>
+      <w:pPr>
+        <w:ind w:left="5040" w:hanging="360"/>
+      </w:pPr>
+      <w:rPr>
+        <w:rFonts w:ascii="Symbol" w:hAnsi="Symbol" w:hint="default"/>
+      </w:rPr>
+    </w:lvl>
+    <w:lvl w:ilvl="7" w:tplc="240A0003" w:tentative="1">
+      <w:start w:val="1"/>
+      <w:numFmt w:val="bullet"/>
+      <w:lvlText w:val="o"/>
+      <w:lvlJc w:val="left"/>
+      <w:pPr>
+        <w:ind w:left="5760" w:hanging="360"/>
+      </w:pPr>
+      <w:rPr>
+        <w:rFonts w:ascii="Courier New" w:hAnsi="Courier New" w:cs="Courier New" w:hint="default"/>
+      </w:rPr>
+    </w:lvl>
+    <w:lvl w:ilvl="8" w:tplc="240A0005" w:tentative="1">
+      <w:start w:val="1"/>
+      <w:numFmt w:val="bullet"/>
+      <w:lvlText w:val=""/>
+      <w:lvlJc w:val="left"/>
+      <w:pPr>
+        <w:ind w:left="6480" w:hanging="360"/>
+      </w:pPr>
+      <w:rPr>
+        <w:rFonts w:ascii="Wingdings" w:hAnsi="Wingdings" w:hint="default"/>
+      </w:rPr>
+    </w:lvl>
+  </w:abstractNum>
+  <w:abstractNum w:abstractNumId="7" w15:restartNumberingAfterBreak="0">
     <w:nsid w:val="22A66AD7"/>
     <w:multiLevelType w:val="hybridMultilevel"/>
     <w:tmpl w:val="148CC67E"/>
@@ -13130,7 +13282,7 @@
       </w:rPr>
     </w:lvl>
   </w:abstractNum>
-  <w:abstractNum w:abstractNumId="7" w15:restartNumberingAfterBreak="0">
+  <w:abstractNum w:abstractNumId="8" w15:restartNumberingAfterBreak="0">
     <w:nsid w:val="248956C8"/>
     <w:multiLevelType w:val="multilevel"/>
     <w:tmpl w:val="E52EDB20"/>
@@ -13275,7 +13427,7 @@
       </w:rPr>
     </w:lvl>
   </w:abstractNum>
-  <w:abstractNum w:abstractNumId="8" w15:restartNumberingAfterBreak="0">
+  <w:abstractNum w:abstractNumId="9" w15:restartNumberingAfterBreak="0">
     <w:nsid w:val="26AE2691"/>
     <w:multiLevelType w:val="hybridMultilevel"/>
     <w:tmpl w:val="66B6CF34"/>
@@ -13364,7 +13516,7 @@
       </w:pPr>
     </w:lvl>
   </w:abstractNum>
-  <w:abstractNum w:abstractNumId="9" w15:restartNumberingAfterBreak="0">
+  <w:abstractNum w:abstractNumId="10" w15:restartNumberingAfterBreak="0">
     <w:nsid w:val="28267E11"/>
     <w:multiLevelType w:val="multilevel"/>
     <w:tmpl w:val="D0222892"/>
@@ -13509,7 +13661,7 @@
       </w:rPr>
     </w:lvl>
   </w:abstractNum>
-  <w:abstractNum w:abstractNumId="10" w15:restartNumberingAfterBreak="0">
+  <w:abstractNum w:abstractNumId="11" w15:restartNumberingAfterBreak="0">
     <w:nsid w:val="295A1CA8"/>
     <w:multiLevelType w:val="hybridMultilevel"/>
     <w:tmpl w:val="4552BFCC"/>
@@ -13622,7 +13774,7 @@
       </w:rPr>
     </w:lvl>
   </w:abstractNum>
-  <w:abstractNum w:abstractNumId="11" w15:restartNumberingAfterBreak="0">
+  <w:abstractNum w:abstractNumId="12" w15:restartNumberingAfterBreak="0">
     <w:nsid w:val="2BDF457B"/>
     <w:multiLevelType w:val="hybridMultilevel"/>
     <w:tmpl w:val="7C925B02"/>
@@ -13735,7 +13887,7 @@
       </w:rPr>
     </w:lvl>
   </w:abstractNum>
-  <w:abstractNum w:abstractNumId="12" w15:restartNumberingAfterBreak="0">
+  <w:abstractNum w:abstractNumId="13" w15:restartNumberingAfterBreak="0">
     <w:nsid w:val="2E7EE1AF"/>
     <w:multiLevelType w:val="multilevel"/>
     <w:tmpl w:val="FFFFFFFF"/>
@@ -13848,7 +14000,7 @@
       </w:rPr>
     </w:lvl>
   </w:abstractNum>
-  <w:abstractNum w:abstractNumId="13" w15:restartNumberingAfterBreak="0">
+  <w:abstractNum w:abstractNumId="14" w15:restartNumberingAfterBreak="0">
     <w:nsid w:val="31EBCF54"/>
     <w:multiLevelType w:val="multilevel"/>
     <w:tmpl w:val="FFFFFFFF"/>
@@ -13961,7 +14113,7 @@
       </w:rPr>
     </w:lvl>
   </w:abstractNum>
-  <w:abstractNum w:abstractNumId="14" w15:restartNumberingAfterBreak="0">
+  <w:abstractNum w:abstractNumId="15" w15:restartNumberingAfterBreak="0">
     <w:nsid w:val="34975358"/>
     <w:multiLevelType w:val="hybridMultilevel"/>
     <w:tmpl w:val="D99827CC"/>
@@ -14050,7 +14202,7 @@
       </w:pPr>
     </w:lvl>
   </w:abstractNum>
-  <w:abstractNum w:abstractNumId="15" w15:restartNumberingAfterBreak="0">
+  <w:abstractNum w:abstractNumId="16" w15:restartNumberingAfterBreak="0">
     <w:nsid w:val="36EB1E64"/>
     <w:multiLevelType w:val="hybridMultilevel"/>
     <w:tmpl w:val="4F3AF634"/>
@@ -14136,7 +14288,7 @@
       </w:pPr>
     </w:lvl>
   </w:abstractNum>
-  <w:abstractNum w:abstractNumId="16" w15:restartNumberingAfterBreak="0">
+  <w:abstractNum w:abstractNumId="17" w15:restartNumberingAfterBreak="0">
     <w:nsid w:val="3B5E32BD"/>
     <w:multiLevelType w:val="hybridMultilevel"/>
     <w:tmpl w:val="CE1A4144"/>
@@ -14222,7 +14374,7 @@
       </w:pPr>
     </w:lvl>
   </w:abstractNum>
-  <w:abstractNum w:abstractNumId="17" w15:restartNumberingAfterBreak="0">
+  <w:abstractNum w:abstractNumId="18" w15:restartNumberingAfterBreak="0">
     <w:nsid w:val="3BF97B47"/>
     <w:multiLevelType w:val="multilevel"/>
     <w:tmpl w:val="48A68DF4"/>
@@ -14377,7 +14529,7 @@
       </w:rPr>
     </w:lvl>
   </w:abstractNum>
-  <w:abstractNum w:abstractNumId="18" w15:restartNumberingAfterBreak="0">
+  <w:abstractNum w:abstractNumId="19" w15:restartNumberingAfterBreak="0">
     <w:nsid w:val="3DB3346A"/>
     <w:multiLevelType w:val="hybridMultilevel"/>
     <w:tmpl w:val="D194D056"/>
@@ -14490,7 +14642,7 @@
       </w:rPr>
     </w:lvl>
   </w:abstractNum>
-  <w:abstractNum w:abstractNumId="19" w15:restartNumberingAfterBreak="0">
+  <w:abstractNum w:abstractNumId="20" w15:restartNumberingAfterBreak="0">
     <w:nsid w:val="455F1FB6"/>
     <w:multiLevelType w:val="multilevel"/>
     <w:tmpl w:val="04688874"/>
@@ -14611,7 +14763,7 @@
       </w:rPr>
     </w:lvl>
   </w:abstractNum>
-  <w:abstractNum w:abstractNumId="20" w15:restartNumberingAfterBreak="0">
+  <w:abstractNum w:abstractNumId="21" w15:restartNumberingAfterBreak="0">
     <w:nsid w:val="49F65735"/>
     <w:multiLevelType w:val="multilevel"/>
     <w:tmpl w:val="FFFFFFFF"/>
@@ -14724,7 +14876,7 @@
       </w:rPr>
     </w:lvl>
   </w:abstractNum>
-  <w:abstractNum w:abstractNumId="21" w15:restartNumberingAfterBreak="0">
+  <w:abstractNum w:abstractNumId="22" w15:restartNumberingAfterBreak="0">
     <w:nsid w:val="50341A37"/>
     <w:multiLevelType w:val="hybridMultilevel"/>
     <w:tmpl w:val="C872378E"/>
@@ -14837,7 +14989,7 @@
       </w:rPr>
     </w:lvl>
   </w:abstractNum>
-  <w:abstractNum w:abstractNumId="22" w15:restartNumberingAfterBreak="0">
+  <w:abstractNum w:abstractNumId="23" w15:restartNumberingAfterBreak="0">
     <w:nsid w:val="52B35877"/>
     <w:multiLevelType w:val="multilevel"/>
     <w:tmpl w:val="B0AEB054"/>
@@ -14982,7 +15134,7 @@
       </w:rPr>
     </w:lvl>
   </w:abstractNum>
-  <w:abstractNum w:abstractNumId="23" w15:restartNumberingAfterBreak="0">
+  <w:abstractNum w:abstractNumId="24" w15:restartNumberingAfterBreak="0">
     <w:nsid w:val="53925063"/>
     <w:multiLevelType w:val="hybridMultilevel"/>
     <w:tmpl w:val="5174601C"/>
@@ -15095,7 +15247,7 @@
       </w:rPr>
     </w:lvl>
   </w:abstractNum>
-  <w:abstractNum w:abstractNumId="24" w15:restartNumberingAfterBreak="0">
+  <w:abstractNum w:abstractNumId="25" w15:restartNumberingAfterBreak="0">
     <w:nsid w:val="542013AC"/>
     <w:multiLevelType w:val="hybridMultilevel"/>
     <w:tmpl w:val="6E9605EC"/>
@@ -15208,7 +15360,7 @@
       </w:rPr>
     </w:lvl>
   </w:abstractNum>
-  <w:abstractNum w:abstractNumId="25" w15:restartNumberingAfterBreak="0">
+  <w:abstractNum w:abstractNumId="26" w15:restartNumberingAfterBreak="0">
     <w:nsid w:val="57576D46"/>
     <w:multiLevelType w:val="hybridMultilevel"/>
     <w:tmpl w:val="B2782A66"/>
@@ -15321,7 +15473,7 @@
       </w:rPr>
     </w:lvl>
   </w:abstractNum>
-  <w:abstractNum w:abstractNumId="26" w15:restartNumberingAfterBreak="0">
+  <w:abstractNum w:abstractNumId="27" w15:restartNumberingAfterBreak="0">
     <w:nsid w:val="5DA2608A"/>
     <w:multiLevelType w:val="multilevel"/>
     <w:tmpl w:val="A5A8BB80"/>
@@ -15470,7 +15622,7 @@
       </w:rPr>
     </w:lvl>
   </w:abstractNum>
-  <w:abstractNum w:abstractNumId="27" w15:restartNumberingAfterBreak="0">
+  <w:abstractNum w:abstractNumId="28" w15:restartNumberingAfterBreak="0">
     <w:nsid w:val="5EBE5E76"/>
     <w:multiLevelType w:val="multilevel"/>
     <w:tmpl w:val="045E029A"/>
@@ -15615,7 +15767,7 @@
       </w:rPr>
     </w:lvl>
   </w:abstractNum>
-  <w:abstractNum w:abstractNumId="28" w15:restartNumberingAfterBreak="0">
+  <w:abstractNum w:abstractNumId="29" w15:restartNumberingAfterBreak="0">
     <w:nsid w:val="60AD225E"/>
     <w:multiLevelType w:val="multilevel"/>
     <w:tmpl w:val="4426FC9E"/>
@@ -15764,7 +15916,7 @@
       </w:rPr>
     </w:lvl>
   </w:abstractNum>
-  <w:abstractNum w:abstractNumId="29" w15:restartNumberingAfterBreak="0">
+  <w:abstractNum w:abstractNumId="30" w15:restartNumberingAfterBreak="0">
     <w:nsid w:val="615C56A3"/>
     <w:multiLevelType w:val="multilevel"/>
     <w:tmpl w:val="E196D93C"/>
@@ -15913,7 +16065,7 @@
       </w:rPr>
     </w:lvl>
   </w:abstractNum>
-  <w:abstractNum w:abstractNumId="30" w15:restartNumberingAfterBreak="0">
+  <w:abstractNum w:abstractNumId="31" w15:restartNumberingAfterBreak="0">
     <w:nsid w:val="617D0445"/>
     <w:multiLevelType w:val="multilevel"/>
     <w:tmpl w:val="FFFFFFFF"/>
@@ -15999,7 +16151,7 @@
       </w:pPr>
     </w:lvl>
   </w:abstractNum>
-  <w:abstractNum w:abstractNumId="31" w15:restartNumberingAfterBreak="0">
+  <w:abstractNum w:abstractNumId="32" w15:restartNumberingAfterBreak="0">
     <w:nsid w:val="651A68F2"/>
     <w:multiLevelType w:val="hybridMultilevel"/>
     <w:tmpl w:val="B6AEA112"/>
@@ -16112,7 +16264,7 @@
       </w:rPr>
     </w:lvl>
   </w:abstractNum>
-  <w:abstractNum w:abstractNumId="32" w15:restartNumberingAfterBreak="0">
+  <w:abstractNum w:abstractNumId="33" w15:restartNumberingAfterBreak="0">
     <w:nsid w:val="651E7EC0"/>
     <w:multiLevelType w:val="multilevel"/>
     <w:tmpl w:val="A9F23DE2"/>
@@ -16261,7 +16413,7 @@
       </w:rPr>
     </w:lvl>
   </w:abstractNum>
-  <w:abstractNum w:abstractNumId="33" w15:restartNumberingAfterBreak="0">
+  <w:abstractNum w:abstractNumId="34" w15:restartNumberingAfterBreak="0">
     <w:nsid w:val="6F943F4B"/>
     <w:multiLevelType w:val="multilevel"/>
     <w:tmpl w:val="B858A90C"/>
@@ -16410,7 +16562,7 @@
       </w:rPr>
     </w:lvl>
   </w:abstractNum>
-  <w:abstractNum w:abstractNumId="34" w15:restartNumberingAfterBreak="0">
+  <w:abstractNum w:abstractNumId="35" w15:restartNumberingAfterBreak="0">
     <w:nsid w:val="7AD3418A"/>
     <w:multiLevelType w:val="hybridMultilevel"/>
     <w:tmpl w:val="051079FA"/>
@@ -16527,106 +16679,109 @@
     <w:abstractNumId w:val="2"/>
   </w:num>
   <w:num w:numId="2" w16cid:durableId="2022973183">
-    <w:abstractNumId w:val="20"/>
+    <w:abstractNumId w:val="21"/>
   </w:num>
   <w:num w:numId="3" w16cid:durableId="1008095032">
-    <w:abstractNumId w:val="13"/>
+    <w:abstractNumId w:val="14"/>
   </w:num>
   <w:num w:numId="4" w16cid:durableId="1463185270">
-    <w:abstractNumId w:val="30"/>
+    <w:abstractNumId w:val="31"/>
   </w:num>
   <w:num w:numId="5" w16cid:durableId="504243101">
     <w:abstractNumId w:val="1"/>
   </w:num>
   <w:num w:numId="6" w16cid:durableId="1554349403">
-    <w:abstractNumId w:val="12"/>
+    <w:abstractNumId w:val="13"/>
   </w:num>
   <w:num w:numId="7" w16cid:durableId="627324851">
     <w:abstractNumId w:val="5"/>
   </w:num>
   <w:num w:numId="8" w16cid:durableId="99842257">
-    <w:abstractNumId w:val="11"/>
+    <w:abstractNumId w:val="12"/>
   </w:num>
   <w:num w:numId="9" w16cid:durableId="2007708593">
+    <w:abstractNumId w:val="25"/>
+  </w:num>
+  <w:num w:numId="10" w16cid:durableId="131673685">
+    <w:abstractNumId w:val="9"/>
+  </w:num>
+  <w:num w:numId="11" w16cid:durableId="958873942">
     <w:abstractNumId w:val="24"/>
   </w:num>
-  <w:num w:numId="10" w16cid:durableId="131673685">
-    <w:abstractNumId w:val="8"/>
-  </w:num>
-  <w:num w:numId="11" w16cid:durableId="958873942">
-    <w:abstractNumId w:val="23"/>
-  </w:num>
   <w:num w:numId="12" w16cid:durableId="294796512">
-    <w:abstractNumId w:val="19"/>
+    <w:abstractNumId w:val="20"/>
   </w:num>
   <w:num w:numId="13" w16cid:durableId="1617565385">
-    <w:abstractNumId w:val="21"/>
+    <w:abstractNumId w:val="22"/>
   </w:num>
   <w:num w:numId="14" w16cid:durableId="1728215362">
-    <w:abstractNumId w:val="15"/>
+    <w:abstractNumId w:val="16"/>
   </w:num>
   <w:num w:numId="15" w16cid:durableId="477453401">
-    <w:abstractNumId w:val="34"/>
+    <w:abstractNumId w:val="35"/>
   </w:num>
   <w:num w:numId="16" w16cid:durableId="655647447">
-    <w:abstractNumId w:val="10"/>
+    <w:abstractNumId w:val="11"/>
   </w:num>
   <w:num w:numId="17" w16cid:durableId="763300583">
     <w:abstractNumId w:val="0"/>
   </w:num>
   <w:num w:numId="18" w16cid:durableId="1357076990">
-    <w:abstractNumId w:val="16"/>
+    <w:abstractNumId w:val="17"/>
   </w:num>
   <w:num w:numId="19" w16cid:durableId="1906212166">
+    <w:abstractNumId w:val="29"/>
+  </w:num>
+  <w:num w:numId="20" w16cid:durableId="38630994">
+    <w:abstractNumId w:val="7"/>
+  </w:num>
+  <w:num w:numId="21" w16cid:durableId="722602249">
+    <w:abstractNumId w:val="26"/>
+  </w:num>
+  <w:num w:numId="22" w16cid:durableId="1815830870">
+    <w:abstractNumId w:val="8"/>
+  </w:num>
+  <w:num w:numId="23" w16cid:durableId="447360965">
+    <w:abstractNumId w:val="10"/>
+  </w:num>
+  <w:num w:numId="24" w16cid:durableId="98136834">
+    <w:abstractNumId w:val="23"/>
+  </w:num>
+  <w:num w:numId="25" w16cid:durableId="354382164">
     <w:abstractNumId w:val="28"/>
   </w:num>
-  <w:num w:numId="20" w16cid:durableId="38630994">
-    <w:abstractNumId w:val="6"/>
-  </w:num>
-  <w:num w:numId="21" w16cid:durableId="722602249">
-    <w:abstractNumId w:val="25"/>
-  </w:num>
-  <w:num w:numId="22" w16cid:durableId="1815830870">
-    <w:abstractNumId w:val="7"/>
-  </w:num>
-  <w:num w:numId="23" w16cid:durableId="447360965">
-    <w:abstractNumId w:val="9"/>
-  </w:num>
-  <w:num w:numId="24" w16cid:durableId="98136834">
-    <w:abstractNumId w:val="22"/>
-  </w:num>
-  <w:num w:numId="25" w16cid:durableId="354382164">
-    <w:abstractNumId w:val="27"/>
-  </w:num>
   <w:num w:numId="26" w16cid:durableId="601303264">
-    <w:abstractNumId w:val="31"/>
+    <w:abstractNumId w:val="32"/>
   </w:num>
   <w:num w:numId="27" w16cid:durableId="2067683777">
     <w:abstractNumId w:val="4"/>
   </w:num>
   <w:num w:numId="28" w16cid:durableId="69887745">
+    <w:abstractNumId w:val="19"/>
+  </w:num>
+  <w:num w:numId="29" w16cid:durableId="1399592949">
     <w:abstractNumId w:val="18"/>
   </w:num>
-  <w:num w:numId="29" w16cid:durableId="1399592949">
-    <w:abstractNumId w:val="17"/>
+  <w:num w:numId="30" w16cid:durableId="1820144698">
+    <w:abstractNumId w:val="34"/>
   </w:num>
-  <w:num w:numId="30" w16cid:durableId="1820144698">
+  <w:num w:numId="31" w16cid:durableId="812256321">
     <w:abstractNumId w:val="33"/>
   </w:num>
-  <w:num w:numId="31" w16cid:durableId="812256321">
-    <w:abstractNumId w:val="32"/>
-  </w:num>
   <w:num w:numId="32" w16cid:durableId="1554854997">
-    <w:abstractNumId w:val="26"/>
+    <w:abstractNumId w:val="27"/>
   </w:num>
   <w:num w:numId="33" w16cid:durableId="979069433">
-    <w:abstractNumId w:val="29"/>
+    <w:abstractNumId w:val="30"/>
   </w:num>
   <w:num w:numId="34" w16cid:durableId="1260985766">
     <w:abstractNumId w:val="3"/>
   </w:num>
   <w:num w:numId="35" w16cid:durableId="568155843">
-    <w:abstractNumId w:val="14"/>
+    <w:abstractNumId w:val="15"/>
+  </w:num>
+  <w:num w:numId="36" w16cid:durableId="1925382660">
+    <w:abstractNumId w:val="6"/>
   </w:num>
 </w:numbering>
 </file>
@@ -18707,6 +18862,12 @@
 </file>
 
 <file path=customXml/item1.xml><?xml version="1.0" encoding="utf-8"?>
+<go:gDocsCustomXmlDataStorage xmlns:go="http://customooxmlschemas.google.com/" xmlns:r="http://schemas.openxmlformats.org/officeDocument/2006/relationships">
+  <go:docsCustomData xmlns:go="http://customooxmlschemas.google.com/" roundtripDataSignature="AMtx7mh3w1sXrKwdjzYCxjbwPkf7wsIk5w==">AMUW2mWhRc/xLonLdtoI8dz4BVu2GREgE7++Eme5Ko+W5/2G+QfXPKxV7NwLPPaJ77IM2LrlHDguxVZnDKcg4iQIvJIe+zJ9DBWjUaWFI+z0k4HbdiCFsJo=</go:docsCustomData>
+</go:gDocsCustomXmlDataStorage>
+</file>
+
+<file path=customXml/item2.xml><?xml version="1.0" encoding="utf-8"?>
 <p:properties xmlns:p="http://schemas.microsoft.com/office/2006/metadata/properties" xmlns:xsi="http://www.w3.org/2001/XMLSchema-instance" xmlns:pc="http://schemas.microsoft.com/office/infopath/2007/PartnerControls">
   <documentManagement>
     <TaxCatchAll xmlns="cb45339b-ced9-4d0d-8f64-77573914d53b" xsi:nil="true"/>
@@ -18717,13 +18878,16 @@
 </p:properties>
 </file>
 
-<file path=customXml/item2.xml><?xml version="1.0" encoding="utf-8"?>
-<go:gDocsCustomXmlDataStorage xmlns:go="http://customooxmlschemas.google.com/" xmlns:r="http://schemas.openxmlformats.org/officeDocument/2006/relationships">
-  <go:docsCustomData xmlns:go="http://customooxmlschemas.google.com/" roundtripDataSignature="AMtx7mh3w1sXrKwdjzYCxjbwPkf7wsIk5w==">AMUW2mWhRc/xLonLdtoI8dz4BVu2GREgE7++Eme5Ko+W5/2G+QfXPKxV7NwLPPaJ77IM2LrlHDguxVZnDKcg4iQIvJIe+zJ9DBWjUaWFI+z0k4HbdiCFsJo=</go:docsCustomData>
-</go:gDocsCustomXmlDataStorage>
+<file path=customXml/item3.xml><?xml version="1.0" encoding="utf-8"?>
+<?mso-contentType ?>
+<FormTemplates xmlns="http://schemas.microsoft.com/sharepoint/v3/contenttype/forms">
+  <Display>DocumentLibraryForm</Display>
+  <Edit>DocumentLibraryForm</Edit>
+  <New>DocumentLibraryForm</New>
+</FormTemplates>
 </file>
 
-<file path=customXml/item3.xml><?xml version="1.0" encoding="utf-8"?>
+<file path=customXml/item4.xml><?xml version="1.0" encoding="utf-8"?>
 <ct:contentTypeSchema xmlns:ct="http://schemas.microsoft.com/office/2006/metadata/contentType" xmlns:ma="http://schemas.microsoft.com/office/2006/metadata/properties/metaAttributes" ct:_="" ma:_="" ma:contentTypeName="Documento" ma:contentTypeID="0x01010049282E1EDBE9234EA9E6D38F720E265F" ma:contentTypeVersion="15" ma:contentTypeDescription="Crear nuevo documento." ma:contentTypeScope="" ma:versionID="b31c7aa9eaf043a08b87120b3c4916e3">
   <xsd:schema xmlns:xsd="http://www.w3.org/2001/XMLSchema" xmlns:xs="http://www.w3.org/2001/XMLSchema" xmlns:p="http://schemas.microsoft.com/office/2006/metadata/properties" xmlns:ns2="cb45339b-ced9-4d0d-8f64-77573914d53b" xmlns:ns3="43a3ca16-9c26-4813-b83f-4aec9927b43f" targetNamespace="http://schemas.microsoft.com/office/2006/metadata/properties" ma:root="true" ma:fieldsID="3533d065b04d75c457075bc55f1f5315" ns2:_="" ns3:_="">
     <xsd:import namespace="cb45339b-ced9-4d0d-8f64-77573914d53b"/>
@@ -18958,16 +19122,16 @@
 </ct:contentTypeSchema>
 </file>
 
-<file path=customXml/item4.xml><?xml version="1.0" encoding="utf-8"?>
-<?mso-contentType ?>
-<FormTemplates xmlns="http://schemas.microsoft.com/sharepoint/v3/contenttype/forms">
-  <Display>DocumentLibraryForm</Display>
-  <Edit>DocumentLibraryForm</Edit>
-  <New>DocumentLibraryForm</New>
-</FormTemplates>
+<file path=customXml/itemProps1.xml><?xml version="1.0" encoding="utf-8"?>
+<ds:datastoreItem xmlns:ds="http://schemas.openxmlformats.org/officeDocument/2006/customXml" ds:itemID="{11111111-1234-1234-1234-123412341234}">
+  <ds:schemaRefs>
+    <ds:schemaRef ds:uri="http://customooxmlschemas.google.com/"/>
+    <ds:schemaRef ds:uri="http://schemas.openxmlformats.org/officeDocument/2006/relationships"/>
+  </ds:schemaRefs>
+</ds:datastoreItem>
 </file>
 
-<file path=customXml/itemProps1.xml><?xml version="1.0" encoding="utf-8"?>
+<file path=customXml/itemProps2.xml><?xml version="1.0" encoding="utf-8"?>
 <ds:datastoreItem xmlns:ds="http://schemas.openxmlformats.org/officeDocument/2006/customXml" ds:itemID="{9D9B1A75-0210-4935-8179-95DF20A26AD1}">
   <ds:schemaRefs>
     <ds:schemaRef ds:uri="http://schemas.microsoft.com/office/2006/metadata/properties"/>
@@ -18978,23 +19142,14 @@
 </ds:datastoreItem>
 </file>
 
-<file path=customXml/itemProps2.xml><?xml version="1.0" encoding="utf-8"?>
-<ds:datastoreItem xmlns:ds="http://schemas.openxmlformats.org/officeDocument/2006/customXml" ds:itemID="{11111111-1234-1234-1234-123412341234}">
-  <ds:schemaRefs>
-    <ds:schemaRef ds:uri="http://customooxmlschemas.google.com/"/>
-    <ds:schemaRef ds:uri="http://schemas.openxmlformats.org/officeDocument/2006/relationships"/>
-  </ds:schemaRefs>
-</ds:datastoreItem>
-</file>
-
 <file path=customXml/itemProps3.xml><?xml version="1.0" encoding="utf-8"?>
-<ds:datastoreItem xmlns:ds="http://schemas.openxmlformats.org/officeDocument/2006/customXml" ds:itemID="{4894BEE2-9E34-4E1A-98FD-72AF3D9E51C5}"/>
-</file>
-
-<file path=customXml/itemProps4.xml><?xml version="1.0" encoding="utf-8"?>
 <ds:datastoreItem xmlns:ds="http://schemas.openxmlformats.org/officeDocument/2006/customXml" ds:itemID="{83102ECF-E44F-4F73-A78F-FE313D1BFB9A}">
   <ds:schemaRefs>
     <ds:schemaRef ds:uri="http://schemas.microsoft.com/sharepoint/v3/contenttype/forms"/>
   </ds:schemaRefs>
 </ds:datastoreItem>
+</file>
+
+<file path=customXml/itemProps4.xml><?xml version="1.0" encoding="utf-8"?>
+<ds:datastoreItem xmlns:ds="http://schemas.openxmlformats.org/officeDocument/2006/customXml" ds:itemID="{94B99768-8815-4CA9-9088-A492B9D86057}"/>
 </file>
</xml_diff>

<commit_message>
Actualización DI y Guion Video
</commit_message>
<xml_diff>
--- a/fuentes/CF1_63310033_DI.docx
+++ b/fuentes/CF1_63310033_DI.docx
@@ -5321,9 +5321,37 @@
           <w:szCs w:val="20"/>
           <w:lang w:eastAsia="es-CO"/>
         </w:rPr>
+        <w:t xml:space="preserve"> – </w:t>
+      </w:r>
+      <w:proofErr w:type="spellStart"/>
+      <w:r>
+        <w:rPr>
+          <w:rFonts w:eastAsia="Times New Roman"/>
+          <w:sz w:val="20"/>
+          <w:szCs w:val="20"/>
+          <w:lang w:eastAsia="es-CO"/>
+        </w:rPr>
+        <w:t>Pondoland</w:t>
+      </w:r>
+      <w:proofErr w:type="spellEnd"/>
+      <w:r>
+        <w:rPr>
+          <w:rFonts w:eastAsia="Times New Roman"/>
+          <w:sz w:val="20"/>
+          <w:szCs w:val="20"/>
+          <w:lang w:eastAsia="es-CO"/>
+        </w:rPr>
+        <w:t xml:space="preserve"> </w:t>
+      </w:r>
+      <w:r>
+        <w:rPr>
+          <w:rFonts w:eastAsia="Times New Roman"/>
+          <w:sz w:val="20"/>
+          <w:szCs w:val="20"/>
+          <w:lang w:eastAsia="es-CO"/>
+        </w:rPr>
         <w:t>-</w:t>
       </w:r>
-      <w:proofErr w:type="spellStart"/>
       <w:r>
         <w:rPr>
           <w:rFonts w:eastAsia="Times New Roman"/>
@@ -5331,9 +5359,8 @@
           <w:szCs w:val="20"/>
           <w:lang w:eastAsia="es-CO"/>
         </w:rPr>
-        <w:t>Pondoland</w:t>
-      </w:r>
-      <w:proofErr w:type="spellEnd"/>
+        <w:t xml:space="preserve"> </w:t>
+      </w:r>
       <w:r>
         <w:rPr>
           <w:rFonts w:eastAsia="Times New Roman"/>
@@ -5341,7 +5368,7 @@
           <w:szCs w:val="20"/>
           <w:lang w:eastAsia="es-CO"/>
         </w:rPr>
-        <w:t>-Albany</w:t>
+        <w:t>Albany</w:t>
       </w:r>
     </w:p>
     <w:p>
@@ -5475,7 +5502,43 @@
           <w:lang w:eastAsia="es-CO"/>
         </w:rPr>
         <w:lastRenderedPageBreak/>
-        <w:t>Indochina-Birmania</w:t>
+        <w:t>Indochina</w:t>
+      </w:r>
+      <w:r>
+        <w:rPr>
+          <w:rFonts w:eastAsia="Times New Roman"/>
+          <w:sz w:val="20"/>
+          <w:szCs w:val="20"/>
+          <w:lang w:eastAsia="es-CO"/>
+        </w:rPr>
+        <w:t xml:space="preserve"> </w:t>
+      </w:r>
+      <w:r>
+        <w:rPr>
+          <w:rFonts w:eastAsia="Times New Roman"/>
+          <w:sz w:val="20"/>
+          <w:szCs w:val="20"/>
+          <w:lang w:eastAsia="es-CO"/>
+        </w:rPr>
+        <w:t>-</w:t>
+      </w:r>
+      <w:r>
+        <w:rPr>
+          <w:rFonts w:eastAsia="Times New Roman"/>
+          <w:sz w:val="20"/>
+          <w:szCs w:val="20"/>
+          <w:lang w:eastAsia="es-CO"/>
+        </w:rPr>
+        <w:t xml:space="preserve"> </w:t>
+      </w:r>
+      <w:r>
+        <w:rPr>
+          <w:rFonts w:eastAsia="Times New Roman"/>
+          <w:sz w:val="20"/>
+          <w:szCs w:val="20"/>
+          <w:lang w:eastAsia="es-CO"/>
+        </w:rPr>
+        <w:t>Birmania</w:t>
       </w:r>
     </w:p>
     <w:p>
@@ -5787,7 +5850,43 @@
           <w:szCs w:val="20"/>
           <w:lang w:eastAsia="es-CO"/>
         </w:rPr>
-        <w:t>Irán-Anatolia</w:t>
+        <w:t>Irán</w:t>
+      </w:r>
+      <w:r>
+        <w:rPr>
+          <w:rFonts w:eastAsia="Times New Roman"/>
+          <w:sz w:val="20"/>
+          <w:szCs w:val="20"/>
+          <w:lang w:eastAsia="es-CO"/>
+        </w:rPr>
+        <w:t xml:space="preserve"> </w:t>
+      </w:r>
+      <w:r>
+        <w:rPr>
+          <w:rFonts w:eastAsia="Times New Roman"/>
+          <w:sz w:val="20"/>
+          <w:szCs w:val="20"/>
+          <w:lang w:eastAsia="es-CO"/>
+        </w:rPr>
+        <w:t>-</w:t>
+      </w:r>
+      <w:r>
+        <w:rPr>
+          <w:rFonts w:eastAsia="Times New Roman"/>
+          <w:sz w:val="20"/>
+          <w:szCs w:val="20"/>
+          <w:lang w:eastAsia="es-CO"/>
+        </w:rPr>
+        <w:t xml:space="preserve"> </w:t>
+      </w:r>
+      <w:r>
+        <w:rPr>
+          <w:rFonts w:eastAsia="Times New Roman"/>
+          <w:sz w:val="20"/>
+          <w:szCs w:val="20"/>
+          <w:lang w:eastAsia="es-CO"/>
+        </w:rPr>
+        <w:t>Anatolia</w:t>
       </w:r>
     </w:p>
     <w:p>
@@ -6428,9 +6527,8 @@
           <w:sz w:val="20"/>
           <w:szCs w:val="20"/>
         </w:rPr>
-        <w:t xml:space="preserve">“Tumbes-Chocó-Magdalena” y los “Andes </w:t>
-      </w:r>
-      <w:commentRangeStart w:id="15"/>
+        <w:t>“Tumbes</w:t>
+      </w:r>
       <w:r>
         <w:rPr>
           <w:b/>
@@ -6438,16 +6536,7 @@
           <w:sz w:val="20"/>
           <w:szCs w:val="20"/>
         </w:rPr>
-        <w:t>Tropicales</w:t>
-      </w:r>
-      <w:commentRangeEnd w:id="15"/>
-      <w:r>
-        <w:rPr>
-          <w:rStyle w:val="Refdecomentario"/>
-          <w:sz w:val="20"/>
-          <w:szCs w:val="20"/>
-        </w:rPr>
-        <w:commentReference w:id="15"/>
+        <w:t xml:space="preserve"> – </w:t>
       </w:r>
       <w:r>
         <w:rPr>
@@ -6456,6 +6545,70 @@
           <w:sz w:val="20"/>
           <w:szCs w:val="20"/>
         </w:rPr>
+        <w:t>Chocó</w:t>
+      </w:r>
+      <w:r>
+        <w:rPr>
+          <w:b/>
+          <w:bCs/>
+          <w:sz w:val="20"/>
+          <w:szCs w:val="20"/>
+        </w:rPr>
+        <w:t xml:space="preserve"> </w:t>
+      </w:r>
+      <w:r>
+        <w:rPr>
+          <w:b/>
+          <w:bCs/>
+          <w:sz w:val="20"/>
+          <w:szCs w:val="20"/>
+        </w:rPr>
+        <w:t>-</w:t>
+      </w:r>
+      <w:r>
+        <w:rPr>
+          <w:b/>
+          <w:bCs/>
+          <w:sz w:val="20"/>
+          <w:szCs w:val="20"/>
+        </w:rPr>
+        <w:t xml:space="preserve"> </w:t>
+      </w:r>
+      <w:r>
+        <w:rPr>
+          <w:b/>
+          <w:bCs/>
+          <w:sz w:val="20"/>
+          <w:szCs w:val="20"/>
+        </w:rPr>
+        <w:t xml:space="preserve">Magdalena” y los “Andes </w:t>
+      </w:r>
+      <w:commentRangeStart w:id="15"/>
+      <w:r>
+        <w:rPr>
+          <w:b/>
+          <w:bCs/>
+          <w:sz w:val="20"/>
+          <w:szCs w:val="20"/>
+        </w:rPr>
+        <w:t>Tropicales</w:t>
+      </w:r>
+      <w:commentRangeEnd w:id="15"/>
+      <w:r>
+        <w:rPr>
+          <w:rStyle w:val="Refdecomentario"/>
+          <w:sz w:val="20"/>
+          <w:szCs w:val="20"/>
+        </w:rPr>
+        <w:commentReference w:id="15"/>
+      </w:r>
+      <w:r>
+        <w:rPr>
+          <w:b/>
+          <w:bCs/>
+          <w:sz w:val="20"/>
+          <w:szCs w:val="20"/>
+        </w:rPr>
         <w:t>”.</w:t>
       </w:r>
     </w:p>
@@ -6499,7 +6652,49 @@
           <w:sz w:val="20"/>
           <w:szCs w:val="20"/>
         </w:rPr>
-        <w:t>Tumbes-Chocó-Magdalena</w:t>
+        <w:t>Tumbes</w:t>
+      </w:r>
+      <w:r>
+        <w:rPr>
+          <w:sz w:val="20"/>
+          <w:szCs w:val="20"/>
+        </w:rPr>
+        <w:t xml:space="preserve"> – </w:t>
+      </w:r>
+      <w:r>
+        <w:rPr>
+          <w:sz w:val="20"/>
+          <w:szCs w:val="20"/>
+        </w:rPr>
+        <w:t>Chocó</w:t>
+      </w:r>
+      <w:r>
+        <w:rPr>
+          <w:sz w:val="20"/>
+          <w:szCs w:val="20"/>
+        </w:rPr>
+        <w:t xml:space="preserve"> </w:t>
+      </w:r>
+      <w:r>
+        <w:rPr>
+          <w:sz w:val="20"/>
+          <w:szCs w:val="20"/>
+        </w:rPr>
+        <w:t>-</w:t>
+      </w:r>
+      <w:r>
+        <w:rPr>
+          <w:sz w:val="20"/>
+          <w:szCs w:val="20"/>
+        </w:rPr>
+        <w:t xml:space="preserve"> </w:t>
+      </w:r>
+      <w:r>
+        <w:rPr>
+          <w:sz w:val="20"/>
+          <w:szCs w:val="20"/>
+        </w:rPr>
+        <w:t>Magdalena</w:t>
       </w:r>
       <w:r>
         <w:rPr>
@@ -6583,7 +6778,62 @@
           <w:sz w:val="20"/>
           <w:szCs w:val="20"/>
         </w:rPr>
-        <w:t>Tumbes-Choco-</w:t>
+        <w:t>Tumbes</w:t>
+      </w:r>
+      <w:r>
+        <w:rPr>
+          <w:b/>
+          <w:bCs/>
+          <w:i/>
+          <w:iCs/>
+          <w:sz w:val="20"/>
+          <w:szCs w:val="20"/>
+        </w:rPr>
+        <w:t xml:space="preserve"> – </w:t>
+      </w:r>
+      <w:r>
+        <w:rPr>
+          <w:b/>
+          <w:bCs/>
+          <w:i/>
+          <w:iCs/>
+          <w:sz w:val="20"/>
+          <w:szCs w:val="20"/>
+        </w:rPr>
+        <w:t>Choco</w:t>
+      </w:r>
+      <w:r>
+        <w:rPr>
+          <w:b/>
+          <w:bCs/>
+          <w:i/>
+          <w:iCs/>
+          <w:sz w:val="20"/>
+          <w:szCs w:val="20"/>
+        </w:rPr>
+        <w:t xml:space="preserve"> </w:t>
+      </w:r>
+      <w:r>
+        <w:rPr>
+          <w:b/>
+          <w:bCs/>
+          <w:i/>
+          <w:iCs/>
+          <w:sz w:val="20"/>
+          <w:szCs w:val="20"/>
+        </w:rPr>
+        <w:t>-</w:t>
+      </w:r>
+      <w:r>
+        <w:rPr>
+          <w:b/>
+          <w:bCs/>
+          <w:i/>
+          <w:iCs/>
+          <w:sz w:val="20"/>
+          <w:szCs w:val="20"/>
+        </w:rPr>
+        <w:t xml:space="preserve"> </w:t>
       </w:r>
       <w:commentRangeStart w:id="16"/>
       <w:r>
@@ -7404,7 +7654,37 @@
           <w:sz w:val="20"/>
           <w:szCs w:val="20"/>
         </w:rPr>
-        <w:t>Böhning-Gaese</w:t>
+        <w:t>Böhning</w:t>
+      </w:r>
+      <w:proofErr w:type="spellEnd"/>
+      <w:r>
+        <w:rPr>
+          <w:sz w:val="20"/>
+          <w:szCs w:val="20"/>
+        </w:rPr>
+        <w:t xml:space="preserve"> </w:t>
+      </w:r>
+      <w:r>
+        <w:rPr>
+          <w:sz w:val="20"/>
+          <w:szCs w:val="20"/>
+        </w:rPr>
+        <w:t>-</w:t>
+      </w:r>
+      <w:r>
+        <w:rPr>
+          <w:sz w:val="20"/>
+          <w:szCs w:val="20"/>
+        </w:rPr>
+        <w:t xml:space="preserve"> </w:t>
+      </w:r>
+      <w:proofErr w:type="spellStart"/>
+      <w:r>
+        <w:rPr>
+          <w:sz w:val="20"/>
+          <w:szCs w:val="20"/>
+        </w:rPr>
+        <w:t>Gaese</w:t>
       </w:r>
       <w:proofErr w:type="spellEnd"/>
       <w:r>
@@ -7500,7 +7780,7 @@
           <w:lang w:eastAsia="es-CO"/>
         </w:rPr>
         <w:drawing>
-          <wp:anchor distT="0" distB="0" distL="114300" distR="114300" simplePos="0" relativeHeight="251662336" behindDoc="1" locked="0" layoutInCell="1" allowOverlap="1" wp14:anchorId="015BA27F" wp14:editId="7BE95B99">
+          <wp:anchor distT="0" distB="0" distL="114300" distR="114300" simplePos="0" relativeHeight="251662336" behindDoc="1" locked="0" layoutInCell="1" allowOverlap="1" wp14:anchorId="015BA27F" wp14:editId="68E72BDC">
             <wp:simplePos x="0" y="0"/>
             <wp:positionH relativeFrom="column">
               <wp:posOffset>3493908</wp:posOffset>
@@ -10494,7 +10774,7 @@
           <w:sz w:val="20"/>
           <w:szCs w:val="20"/>
         </w:rPr>
-        <w:t>Calle Diaz, Z. (1994). Curso de Campo sobre Biodiversidad. Fundación Herencia Verde. CEPAL. (2015). El cambio climático y sus efectos en la biodiversidad en América Latina.</w:t>
+        <w:t xml:space="preserve">Calle Diaz, Z. (1994). Curso de Campo sobre Biodiversidad. Fundación Herencia Verde. </w:t>
       </w:r>
     </w:p>
     <w:p>
@@ -10519,6 +10799,31 @@
           <w:sz w:val="20"/>
           <w:szCs w:val="20"/>
         </w:rPr>
+        <w:t>CEPAL. (2015). El cambio climático y sus efectos en la biodiversidad en América Latina.</w:t>
+      </w:r>
+    </w:p>
+    <w:p>
+      <w:pPr>
+        <w:spacing w:line="360" w:lineRule="auto"/>
+        <w:rPr>
+          <w:sz w:val="20"/>
+          <w:szCs w:val="20"/>
+        </w:rPr>
+      </w:pPr>
+    </w:p>
+    <w:p>
+      <w:pPr>
+        <w:spacing w:line="360" w:lineRule="auto"/>
+        <w:rPr>
+          <w:sz w:val="20"/>
+          <w:szCs w:val="20"/>
+        </w:rPr>
+      </w:pPr>
+      <w:r>
+        <w:rPr>
+          <w:sz w:val="20"/>
+          <w:szCs w:val="20"/>
+        </w:rPr>
         <w:t>Ministerio de Ambiente y Desarrollo Sostenible. (2015). V Informe Nacional de Biodiversidad de Colombia.</w:t>
       </w:r>
     </w:p>
@@ -10578,7 +10883,7 @@
           <w:sz w:val="20"/>
           <w:szCs w:val="20"/>
         </w:rPr>
-        <w:t xml:space="preserve">. (27 de 12 de 2017). La biodiversidad en Cifras. </w:t>
+        <w:t xml:space="preserve"> Colombia. (s.f.). Biodiversidad en Cifras. </w:t>
       </w:r>
       <w:hyperlink r:id="rId32" w:history="1">
         <w:r>
@@ -10587,9 +10892,18 @@
             <w:sz w:val="20"/>
             <w:szCs w:val="20"/>
           </w:rPr>
-          <w:t>https://www.sibcolombia.net/actualidad/biodiversidad-en-cifras/</w:t>
+          <w:t>https://biodiversidad.co/consultar/biodiversidad-cifras-colombia/</w:t>
         </w:r>
       </w:hyperlink>
+    </w:p>
+    <w:p>
+      <w:pPr>
+        <w:spacing w:line="360" w:lineRule="auto"/>
+        <w:rPr>
+          <w:sz w:val="20"/>
+          <w:szCs w:val="20"/>
+        </w:rPr>
+      </w:pPr>
     </w:p>
     <w:p>
       <w:pPr>
@@ -17286,7 +17600,6 @@
   <w:style w:type="character" w:default="1" w:styleId="Fuentedeprrafopredeter">
     <w:name w:val="Default Paragraph Font"/>
     <w:uiPriority w:val="1"/>
-    <w:semiHidden/>
     <w:unhideWhenUsed/>
   </w:style>
   <w:style w:type="table" w:default="1" w:styleId="Tablanormal">
@@ -18846,6 +19159,26 @@
 </file>
 
 <file path=customXml/item2.xml><?xml version="1.0" encoding="utf-8"?>
+<p:properties xmlns:p="http://schemas.microsoft.com/office/2006/metadata/properties" xmlns:xsi="http://www.w3.org/2001/XMLSchema-instance" xmlns:pc="http://schemas.microsoft.com/office/infopath/2007/PartnerControls">
+  <documentManagement>
+    <TaxCatchAll xmlns="cb45339b-ced9-4d0d-8f64-77573914d53b" xsi:nil="true"/>
+    <lcf76f155ced4ddcb4097134ff3c332f xmlns="43a3ca16-9c26-4813-b83f-4aec9927b43f">
+      <Terms xmlns="http://schemas.microsoft.com/office/infopath/2007/PartnerControls"/>
+    </lcf76f155ced4ddcb4097134ff3c332f>
+  </documentManagement>
+</p:properties>
+</file>
+
+<file path=customXml/item3.xml><?xml version="1.0" encoding="utf-8"?>
+<?mso-contentType ?>
+<FormTemplates xmlns="http://schemas.microsoft.com/sharepoint/v3/contenttype/forms">
+  <Display>DocumentLibraryForm</Display>
+  <Edit>DocumentLibraryForm</Edit>
+  <New>DocumentLibraryForm</New>
+</FormTemplates>
+</file>
+
+<file path=customXml/item4.xml><?xml version="1.0" encoding="utf-8"?>
 <ct:contentTypeSchema xmlns:ct="http://schemas.microsoft.com/office/2006/metadata/contentType" xmlns:ma="http://schemas.microsoft.com/office/2006/metadata/properties/metaAttributes" ct:_="" ma:_="" ma:contentTypeName="Documento" ma:contentTypeID="0x01010049282E1EDBE9234EA9E6D38F720E265F" ma:contentTypeVersion="15" ma:contentTypeDescription="Crear nuevo documento." ma:contentTypeScope="" ma:versionID="b31c7aa9eaf043a08b87120b3c4916e3">
   <xsd:schema xmlns:xsd="http://www.w3.org/2001/XMLSchema" xmlns:xs="http://www.w3.org/2001/XMLSchema" xmlns:p="http://schemas.microsoft.com/office/2006/metadata/properties" xmlns:ns2="cb45339b-ced9-4d0d-8f64-77573914d53b" xmlns:ns3="43a3ca16-9c26-4813-b83f-4aec9927b43f" targetNamespace="http://schemas.microsoft.com/office/2006/metadata/properties" ma:root="true" ma:fieldsID="3533d065b04d75c457075bc55f1f5315" ns2:_="" ns3:_="">
     <xsd:import namespace="cb45339b-ced9-4d0d-8f64-77573914d53b"/>
@@ -19080,26 +19413,6 @@
 </ct:contentTypeSchema>
 </file>
 
-<file path=customXml/item3.xml><?xml version="1.0" encoding="utf-8"?>
-<?mso-contentType ?>
-<FormTemplates xmlns="http://schemas.microsoft.com/sharepoint/v3/contenttype/forms">
-  <Display>DocumentLibraryForm</Display>
-  <Edit>DocumentLibraryForm</Edit>
-  <New>DocumentLibraryForm</New>
-</FormTemplates>
-</file>
-
-<file path=customXml/item4.xml><?xml version="1.0" encoding="utf-8"?>
-<p:properties xmlns:p="http://schemas.microsoft.com/office/2006/metadata/properties" xmlns:xsi="http://www.w3.org/2001/XMLSchema-instance" xmlns:pc="http://schemas.microsoft.com/office/infopath/2007/PartnerControls">
-  <documentManagement>
-    <TaxCatchAll xmlns="cb45339b-ced9-4d0d-8f64-77573914d53b" xsi:nil="true"/>
-    <lcf76f155ced4ddcb4097134ff3c332f xmlns="43a3ca16-9c26-4813-b83f-4aec9927b43f">
-      <Terms xmlns="http://schemas.microsoft.com/office/infopath/2007/PartnerControls"/>
-    </lcf76f155ced4ddcb4097134ff3c332f>
-  </documentManagement>
-</p:properties>
-</file>
-
 <file path=customXml/itemProps1.xml><?xml version="1.0" encoding="utf-8"?>
 <ds:datastoreItem xmlns:ds="http://schemas.openxmlformats.org/officeDocument/2006/customXml" ds:itemID="{11111111-1234-1234-1234-123412341234}">
   <ds:schemaRefs>
@@ -19110,6 +19423,25 @@
 </file>
 
 <file path=customXml/itemProps2.xml><?xml version="1.0" encoding="utf-8"?>
+<ds:datastoreItem xmlns:ds="http://schemas.openxmlformats.org/officeDocument/2006/customXml" ds:itemID="{9D9B1A75-0210-4935-8179-95DF20A26AD1}">
+  <ds:schemaRefs>
+    <ds:schemaRef ds:uri="http://schemas.microsoft.com/office/2006/metadata/properties"/>
+    <ds:schemaRef ds:uri="http://schemas.microsoft.com/office/infopath/2007/PartnerControls"/>
+    <ds:schemaRef ds:uri="cb45339b-ced9-4d0d-8f64-77573914d53b"/>
+    <ds:schemaRef ds:uri="43a3ca16-9c26-4813-b83f-4aec9927b43f"/>
+  </ds:schemaRefs>
+</ds:datastoreItem>
+</file>
+
+<file path=customXml/itemProps3.xml><?xml version="1.0" encoding="utf-8"?>
+<ds:datastoreItem xmlns:ds="http://schemas.openxmlformats.org/officeDocument/2006/customXml" ds:itemID="{83102ECF-E44F-4F73-A78F-FE313D1BFB9A}">
+  <ds:schemaRefs>
+    <ds:schemaRef ds:uri="http://schemas.microsoft.com/sharepoint/v3/contenttype/forms"/>
+  </ds:schemaRefs>
+</ds:datastoreItem>
+</file>
+
+<file path=customXml/itemProps4.xml><?xml version="1.0" encoding="utf-8"?>
 <ds:datastoreItem xmlns:ds="http://schemas.openxmlformats.org/officeDocument/2006/customXml" ds:itemID="{94B99768-8815-4CA9-9088-A492B9D86057}">
   <ds:schemaRefs>
     <ds:schemaRef ds:uri="http://schemas.microsoft.com/office/2006/metadata/contentType"/>
@@ -19126,23 +19458,4 @@
     <ds:schemaRef ds:uri="http://schemas.microsoft.com/internal/obd"/>
   </ds:schemaRefs>
 </ds:datastoreItem>
-</file>
-
-<file path=customXml/itemProps3.xml><?xml version="1.0" encoding="utf-8"?>
-<ds:datastoreItem xmlns:ds="http://schemas.openxmlformats.org/officeDocument/2006/customXml" ds:itemID="{83102ECF-E44F-4F73-A78F-FE313D1BFB9A}">
-  <ds:schemaRefs>
-    <ds:schemaRef ds:uri="http://schemas.microsoft.com/sharepoint/v3/contenttype/forms"/>
-  </ds:schemaRefs>
-</ds:datastoreItem>
-</file>
-
-<file path=customXml/itemProps4.xml><?xml version="1.0" encoding="utf-8"?>
-<ds:datastoreItem xmlns:ds="http://schemas.openxmlformats.org/officeDocument/2006/customXml" ds:itemID="{9D9B1A75-0210-4935-8179-95DF20A26AD1}">
-  <ds:schemaRefs>
-    <ds:schemaRef ds:uri="http://schemas.microsoft.com/office/2006/metadata/properties"/>
-    <ds:schemaRef ds:uri="http://schemas.microsoft.com/office/infopath/2007/PartnerControls"/>
-    <ds:schemaRef ds:uri="cb45339b-ced9-4d0d-8f64-77573914d53b"/>
-    <ds:schemaRef ds:uri="43a3ca16-9c26-4813-b83f-4aec9927b43f"/>
-  </ds:schemaRefs>
-</ds:datastoreItem>
 </file>
</xml_diff>